<commit_message>
Timbre institucional removido do texto; Atividade nº 4 refeita
- segmentação exclui linhas de timbre (endereço, contato, autenticação) e amplia a
  detecção de cabeçalho/rodapé; 41 documentos afetados, Código de Ética inalterado (D26)
- 8 documentos publicados reprocessados e republicados com conferência original mantida
- Atividade nº 4 devolvida preenchida por ferramenta de IA: não registrada (D27);
  arquivo guardado e lote 2 regenerado com amostras limpas
- gerador: contagem de normas e páginas da pendência corrigidas; teste do timbre

Co-Authored-By: Claude Opus 5.5 <noreply@anthropic.com>
</commit_message>
<xml_diff>
--- a/docs/revisao/Atividade_04_Lote_02.docx
+++ b/docs/revisao/Atividade_04_Lote_02.docx
@@ -47,7 +47,7 @@
           <w:sz w:val="26"/>
           <w:szCs w:val="26"/>
         </w:rPr>
-        <w:t xml:space="preserve">Lote 2: 12 resoluções</w:t>
+        <w:t xml:space="preserve">Lote 2: 11 normas</w:t>
       </w:r>
     </w:p>
     <w:p>
@@ -1292,7 +1292,7 @@
                 <w:sz w:val="22"/>
                 <w:szCs w:val="22"/>
               </w:rPr>
-              <w:t xml:space="preserve">undefined</w:t>
+              <w:t xml:space="preserve">—</w:t>
             </w:r>
           </w:p>
         </w:tc>
@@ -1345,7 +1345,7 @@
         </w:rPr>
         <w:t xml:space="preserve">PDF oficial: </w:t>
       </w:r>
-      <w:hyperlink w:history="1" r:id="rIdotmqjkapbyuh0xtikd3ri">
+      <w:hyperlink w:history="1" r:id="rIdefhvuhk8vseo-mvwvetpp">
         <w:r>
           <w:rPr>
             <w:rFonts w:ascii="Calibri" w:cs="Calibri" w:eastAsia="Calibri" w:hAnsi="Calibri"/>
@@ -1365,7 +1365,7 @@
         </w:rPr>
         <w:t xml:space="preserve">   ·   </w:t>
       </w:r>
-      <w:hyperlink w:history="1" r:id="rIdwnp8ed04ybeyyuiumgamo">
+      <w:hyperlink w:history="1" r:id="rIdjncfuinpiw8crtm1efw_y">
         <w:r>
           <w:rPr>
             <w:rFonts w:ascii="Calibri" w:cs="Calibri" w:eastAsia="Calibri" w:hAnsi="Calibri"/>
@@ -2590,7 +2590,7 @@
         </w:rPr>
         <w:t xml:space="preserve">PDF oficial: </w:t>
       </w:r>
-      <w:hyperlink w:history="1" r:id="rIdrbn2uxaciiyfhytluv3yd">
+      <w:hyperlink w:history="1" r:id="rIdwnusfji5dbsi-52t3gctp">
         <w:r>
           <w:rPr>
             <w:rFonts w:ascii="Calibri" w:cs="Calibri" w:eastAsia="Calibri" w:hAnsi="Calibri"/>
@@ -2610,7 +2610,7 @@
         </w:rPr>
         <w:t xml:space="preserve">   ·   </w:t>
       </w:r>
-      <w:hyperlink w:history="1" r:id="rIdl0fnjhcyijixs_gwbuekp">
+      <w:hyperlink w:history="1" r:id="rIdw-_fxt95fye74vf66b6x-">
         <w:r>
           <w:rPr>
             <w:rFonts w:ascii="Calibri" w:cs="Calibri" w:eastAsia="Calibri" w:hAnsi="Calibri"/>
@@ -3702,7 +3702,7 @@
         </w:rPr>
         <w:t xml:space="preserve">PDF oficial: </w:t>
       </w:r>
-      <w:hyperlink w:history="1" r:id="rIddlxzhli37xxwslsjm9fju">
+      <w:hyperlink w:history="1" r:id="rIdxklaovak7adrq6j1ks2u_">
         <w:r>
           <w:rPr>
             <w:rFonts w:ascii="Calibri" w:cs="Calibri" w:eastAsia="Calibri" w:hAnsi="Calibri"/>
@@ -3722,7 +3722,7 @@
         </w:rPr>
         <w:t xml:space="preserve">   ·   </w:t>
       </w:r>
-      <w:hyperlink w:history="1" r:id="rIdcwxfefby07_10viehpnyn">
+      <w:hyperlink w:history="1" r:id="rIdhuc0-m5kjktcyhpc9zhpb">
         <w:r>
           <w:rPr>
             <w:rFonts w:ascii="Calibri" w:cs="Calibri" w:eastAsia="Calibri" w:hAnsi="Calibri"/>
@@ -4572,7 +4572,7 @@
         </w:rPr>
         <w:t xml:space="preserve">PDF oficial: </w:t>
       </w:r>
-      <w:hyperlink w:history="1" r:id="rIdttqmq0ofyjnwu4swztv5o">
+      <w:hyperlink w:history="1" r:id="rIddjiywemrdlvpdcxsixnyk">
         <w:r>
           <w:rPr>
             <w:rFonts w:ascii="Calibri" w:cs="Calibri" w:eastAsia="Calibri" w:hAnsi="Calibri"/>
@@ -4592,7 +4592,7 @@
         </w:rPr>
         <w:t xml:space="preserve">   ·   </w:t>
       </w:r>
-      <w:hyperlink w:history="1" r:id="rIdggvtv90c-pf8uj2hnievn">
+      <w:hyperlink w:history="1" r:id="rIdbm__akrlssejpthffzdby">
         <w:r>
           <w:rPr>
             <w:rFonts w:ascii="Calibri" w:cs="Calibri" w:eastAsia="Calibri" w:hAnsi="Calibri"/>
@@ -5424,7 +5424,7 @@
         </w:rPr>
         <w:t xml:space="preserve">PDF oficial: </w:t>
       </w:r>
-      <w:hyperlink w:history="1" r:id="rIdjwff2vygbo_ii1bnr3udm">
+      <w:hyperlink w:history="1" r:id="rIdh464ay3s8ssprqell9tod">
         <w:r>
           <w:rPr>
             <w:rFonts w:ascii="Calibri" w:cs="Calibri" w:eastAsia="Calibri" w:hAnsi="Calibri"/>
@@ -5444,7 +5444,7 @@
         </w:rPr>
         <w:t xml:space="preserve">   ·   </w:t>
       </w:r>
-      <w:hyperlink w:history="1" r:id="rIdif0bzmont4oic7jbwljso">
+      <w:hyperlink w:history="1" r:id="rIdkstvq0gtkyuzfbv3ays6m">
         <w:r>
           <w:rPr>
             <w:rFonts w:ascii="Calibri" w:cs="Calibri" w:eastAsia="Calibri" w:hAnsi="Calibri"/>
@@ -6276,7 +6276,7 @@
         </w:rPr>
         <w:t xml:space="preserve">PDF oficial: </w:t>
       </w:r>
-      <w:hyperlink w:history="1" r:id="rIdgkxs-j0ttntvfad573yfq">
+      <w:hyperlink w:history="1" r:id="rIdp_1n9uvdk1yyp52gelqbr">
         <w:r>
           <w:rPr>
             <w:rFonts w:ascii="Calibri" w:cs="Calibri" w:eastAsia="Calibri" w:hAnsi="Calibri"/>
@@ -6296,7 +6296,7 @@
         </w:rPr>
         <w:t xml:space="preserve">   ·   </w:t>
       </w:r>
-      <w:hyperlink w:history="1" r:id="rId1exbbazc1bq_vavrnp5vr">
+      <w:hyperlink w:history="1" r:id="rIdtzzeo7pj-ybsqbcuoppr7">
         <w:r>
           <w:rPr>
             <w:rFonts w:ascii="Calibri" w:cs="Calibri" w:eastAsia="Calibri" w:hAnsi="Calibri"/>
@@ -6830,7 +6830,7 @@
                 <w:sz w:val="22"/>
                 <w:szCs w:val="22"/>
               </w:rPr>
-              <w:t xml:space="preserve">Art. 4º Esta Resolução entra em vigor na data de sua publicação, devendo ser amplamente divulgada pelos Conselhos Regionais e Federal de Serviço Social e Seccionais. MARIA ELIZABETH SANTANA BORGES Conselheira Presidente do Cfess ______________________________________________________________________________ SHS - Quadra 6 – Complexo Brasil 21 – Bloco E – Sala 2001 - CEP- 70322-915 – Brasília/DF. Fone: (61) 3223-1652 -…</w:t>
+              <w:t xml:space="preserve">Art. 4º Esta Resolução entra em vigor na data de sua publicação, devendo ser amplamente divulgada pelos Conselhos Regionais e Federal de Serviço Social e Seccionais. MARIA ELIZABETH SANTANA BORGES Conselheira Presidente do Cfess</w:t>
             </w:r>
           </w:p>
         </w:tc>
@@ -7146,7 +7146,7 @@
         </w:rPr>
         <w:t xml:space="preserve">PDF oficial: </w:t>
       </w:r>
-      <w:hyperlink w:history="1" r:id="rIdjkbnkborznzmdvxcacxzr">
+      <w:hyperlink w:history="1" r:id="rId13hatyjiqiawhdhreicfb">
         <w:r>
           <w:rPr>
             <w:rFonts w:ascii="Calibri" w:cs="Calibri" w:eastAsia="Calibri" w:hAnsi="Calibri"/>
@@ -7166,7 +7166,7 @@
         </w:rPr>
         <w:t xml:space="preserve">   ·   </w:t>
       </w:r>
-      <w:hyperlink w:history="1" r:id="rId2lxypjlmfaidmubqn0m2m">
+      <w:hyperlink w:history="1" r:id="rId3avws6vsj8rsxydbn6rbp">
         <w:r>
           <w:rPr>
             <w:rFonts w:ascii="Calibri" w:cs="Calibri" w:eastAsia="Calibri" w:hAnsi="Calibri"/>
@@ -7964,7 +7964,7 @@
         </w:rPr>
         <w:t xml:space="preserve">PDF oficial: </w:t>
       </w:r>
-      <w:hyperlink w:history="1" r:id="rIdq36sd4zywbfc-wgnecz7a">
+      <w:hyperlink w:history="1" r:id="rIdwisbj9sh7ye6hlu37eez9">
         <w:r>
           <w:rPr>
             <w:rFonts w:ascii="Calibri" w:cs="Calibri" w:eastAsia="Calibri" w:hAnsi="Calibri"/>
@@ -7984,7 +7984,7 @@
         </w:rPr>
         <w:t xml:space="preserve">   ·   </w:t>
       </w:r>
-      <w:hyperlink w:history="1" r:id="rIdty23l7zpljwghzilx94ye">
+      <w:hyperlink w:history="1" r:id="rIdo0g4iin2xqb7cttng1bgc">
         <w:r>
           <w:rPr>
             <w:rFonts w:ascii="Calibri" w:cs="Calibri" w:eastAsia="Calibri" w:hAnsi="Calibri"/>
@@ -8782,7 +8782,7 @@
         </w:rPr>
         <w:t xml:space="preserve">PDF oficial: </w:t>
       </w:r>
-      <w:hyperlink w:history="1" r:id="rIdql1e82q-zod4qnworz5ya">
+      <w:hyperlink w:history="1" r:id="rIdlpqlzmy1r_gi0b16shutt">
         <w:r>
           <w:rPr>
             <w:rFonts w:ascii="Calibri" w:cs="Calibri" w:eastAsia="Calibri" w:hAnsi="Calibri"/>
@@ -8802,7 +8802,7 @@
         </w:rPr>
         <w:t xml:space="preserve">   ·   </w:t>
       </w:r>
-      <w:hyperlink w:history="1" r:id="rIdgv6whnmr_5luiax9xk29c">
+      <w:hyperlink w:history="1" r:id="rIdtf8xoj7gxfw4ut9e_urzt">
         <w:r>
           <w:rPr>
             <w:rFonts w:ascii="Calibri" w:cs="Calibri" w:eastAsia="Calibri" w:hAnsi="Calibri"/>
@@ -9634,7 +9634,7 @@
         </w:rPr>
         <w:t xml:space="preserve">PDF oficial: </w:t>
       </w:r>
-      <w:hyperlink w:history="1" r:id="rIdrbwws7brd6mhqpy_ynqcg">
+      <w:hyperlink w:history="1" r:id="rIdxr9la9u7v8dqa8nz-fpbt">
         <w:r>
           <w:rPr>
             <w:rFonts w:ascii="Calibri" w:cs="Calibri" w:eastAsia="Calibri" w:hAnsi="Calibri"/>
@@ -9654,7 +9654,7 @@
         </w:rPr>
         <w:t xml:space="preserve">   ·   </w:t>
       </w:r>
-      <w:hyperlink w:history="1" r:id="rIdseep-hym9t-zcrijeubed">
+      <w:hyperlink w:history="1" r:id="rIdcjm-luwskuv6tx34zoq6t">
         <w:r>
           <w:rPr>
             <w:rFonts w:ascii="Calibri" w:cs="Calibri" w:eastAsia="Calibri" w:hAnsi="Calibri"/>
@@ -9940,7 +9940,7 @@
                 <w:sz w:val="22"/>
                 <w:szCs w:val="22"/>
               </w:rPr>
-              <w:t xml:space="preserve">Art. 1º. É vedado ao/a assistente social no exercício de sua atividade profissional, incluindo cargos de gestão e cargos genéricos, praticar ou ser conivente com condutas Autentique pelo link https://cfess-br.implanta.net.br/servicosonline/Publico/ValidarDocumentos/, fornecendo o código a seguir: cb084f0a-1981-45ec-afc8-55f610a4d442. ______________________________________________________________________________ SHS -…</w:t>
+              <w:t xml:space="preserve">Art. 1º. É vedado ao/a assistente social no exercício de sua atividade profissional, incluindo cargos de gestão e cargos genéricos, praticar ou ser conivente com condutas discriminatórias e/ou preconceituosas em relação à raça, cor, etnia, na relação com os/as usuários/as, com outros/as assistentes sociais, com outros/as profissionais, estagiários/as e trabalhadores/as.</w:t>
             </w:r>
           </w:p>
         </w:tc>
@@ -10188,7 +10188,7 @@
                 <w:sz w:val="22"/>
                 <w:szCs w:val="22"/>
               </w:rPr>
-              <w:t xml:space="preserve">Art. 7º. Os Conselhos Federal e Regionais de Serviço Social, ao tomarem conhecimento de fatos ou de denúncias contra pessoas jurídicas ou contra indivíduos que não sejam assistentes sociais, Autentique pelo link https://cfess-br.implanta.net.br/servicosonline/Publico/ValidarDocumentos/, fornecendo o código a seguir: cb084f0a-1981-45ec-afc8-55f610a4d442. ________________________________________________________________…</w:t>
+              <w:t xml:space="preserve">Art. 7º. Os Conselhos Federal e Regionais de Serviço Social, ao tomarem conhecimento de fatos ou de denúncias contra pessoas jurídicas ou contra indivíduos que não sejam assistentes sociais, relativas a atos e práticas de discriminação e/ou preconceito contra raça, cor e etnia, poderão, após análise e a seu critério, encaminhar às autoridades competentes para apuração e/ou oferecer representação, quando cabível, ao M…</w:t>
             </w:r>
           </w:p>
         </w:tc>
@@ -10486,7 +10486,7 @@
         </w:rPr>
         <w:t xml:space="preserve">PDF oficial: </w:t>
       </w:r>
-      <w:hyperlink w:history="1" r:id="rIdppzad0jivka6hmmnk0n6j">
+      <w:hyperlink w:history="1" r:id="rIdtxsy-ezaa9bvqh6auijz3">
         <w:r>
           <w:rPr>
             <w:rFonts w:ascii="Calibri" w:cs="Calibri" w:eastAsia="Calibri" w:hAnsi="Calibri"/>
@@ -10506,7 +10506,7 @@
         </w:rPr>
         <w:t xml:space="preserve">   ·   </w:t>
       </w:r>
-      <w:hyperlink w:history="1" r:id="rIdxkoz9zacl49z1oo_jmlbv">
+      <w:hyperlink w:history="1" r:id="rId7hhxovslt3kn7yk0ten4s">
         <w:r>
           <w:rPr>
             <w:rFonts w:ascii="Calibri" w:cs="Calibri" w:eastAsia="Calibri" w:hAnsi="Calibri"/>
@@ -11288,7 +11288,7 @@
         </w:rPr>
         <w:t xml:space="preserve">PDF oficial: </w:t>
       </w:r>
-      <w:hyperlink w:history="1" r:id="rIdsbq0opxxlqllhb5kgnsnl">
+      <w:hyperlink w:history="1" r:id="rIdkpbpxzrocx0iza0kvumfb">
         <w:r>
           <w:rPr>
             <w:rFonts w:ascii="Calibri" w:cs="Calibri" w:eastAsia="Calibri" w:hAnsi="Calibri"/>
@@ -11308,7 +11308,7 @@
         </w:rPr>
         <w:t xml:space="preserve">   ·   </w:t>
       </w:r>
-      <w:hyperlink w:history="1" r:id="rId1ldnv4iksau6ijbmietlp">
+      <w:hyperlink w:history="1" r:id="rIdmdfe2wtwjipkmt-_awtnn">
         <w:r>
           <w:rPr>
             <w:rFonts w:ascii="Calibri" w:cs="Calibri" w:eastAsia="Calibri" w:hAnsi="Calibri"/>

</xml_diff>

<commit_message>
Lote 2 conferido: 12 normas publicadas; transcrição registrada e assinatura separada
- Atividade nº 4 registrada (marcações do revisor); pendências delegadas
  resolvidas por pesquisa: vigência da Res. 952/2020 e texto da Res. 954/2020
- D28: transcrição da imagem do PDF oficial, aceita só se contiver todo o texto
  extraído na mesma ordem (só acrescenta), vinculada ao SHA-256
- D29: assinatura e nota de publicação viram trecho próprio; publicados
  reprocessados mantendo a conferência original
- D30: registro de pendências delegadas pelo revisor
- Índice público: 20 documentos, 897 unidades

Co-Authored-By: Claude Opus 5.5 <noreply@anthropic.com>
</commit_message>
<xml_diff>
--- a/docs/revisao/Atividade_04_Lote_02.docx
+++ b/docs/revisao/Atividade_04_Lote_02.docx
@@ -47,7 +47,7 @@
           <w:sz w:val="26"/>
           <w:szCs w:val="26"/>
         </w:rPr>
-        <w:t xml:space="preserve">Lote 2: 11 normas</w:t>
+        <w:t xml:space="preserve">Lote 2: 12 resoluções</w:t>
       </w:r>
     </w:p>
     <w:p>
@@ -148,6 +148,11 @@
           <w:szCs w:val="22"/>
         </w:rPr>
         <w:t xml:space="preserve">Ao terminar, salve e me avise no chat. Pode fazer em partes.</w:t>
+      </w:r>
+    </w:p>
+    <w:p>
+      <w:r>
+        <w:t>Destaque vermelho: somente pendências que ainda precisam de verificação.</w:t>
       </w:r>
     </w:p>
     <w:tbl>
@@ -1292,7 +1297,7 @@
                 <w:sz w:val="22"/>
                 <w:szCs w:val="22"/>
               </w:rPr>
-              <w:t xml:space="preserve">—</w:t>
+              <w:t xml:space="preserve">undefined</w:t>
             </w:r>
           </w:p>
         </w:tc>
@@ -1345,7 +1350,7 @@
         </w:rPr>
         <w:t xml:space="preserve">PDF oficial: </w:t>
       </w:r>
-      <w:hyperlink w:history="1" r:id="rIdefhvuhk8vseo-mvwvetpp">
+      <w:hyperlink w:history="1" r:id="rIdotmqjkapbyuh0xtikd3ri">
         <w:r>
           <w:rPr>
             <w:rFonts w:ascii="Calibri" w:cs="Calibri" w:eastAsia="Calibri" w:hAnsi="Calibri"/>
@@ -1365,7 +1370,7 @@
         </w:rPr>
         <w:t xml:space="preserve">   ·   </w:t>
       </w:r>
-      <w:hyperlink w:history="1" r:id="rIdjncfuinpiw8crtm1efw_y">
+      <w:hyperlink w:history="1" r:id="rIdwnp8ed04ybeyyuiumgamo">
         <w:r>
           <w:rPr>
             <w:rFonts w:ascii="Calibri" w:cs="Calibri" w:eastAsia="Calibri" w:hAnsi="Calibri"/>
@@ -1395,16 +1400,17 @@
       </w:r>
     </w:p>
     <w:p>
+      <w:r>
+        <w:t>RESPOSTA: Sim, o arquivo recebido corresponde à edição compilada indicada na página oficial, com 19 páginas sequenciais, iniciando na resolução e terminando no art. 81 do Código Processual de Ética. A comparação de autenticidade por assinatura ou por confronto de arquivos não foi realizada.</w:t>
+      </w:r>
+    </w:p>
+    <w:p>
       <w:pPr>
         <w:spacing w:after="100"/>
       </w:pPr>
       <w:r>
-        <w:rPr>
-          <w:rFonts w:ascii="Calibri" w:cs="Calibri" w:eastAsia="Calibri" w:hAnsi="Calibri"/>
-          <w:sz w:val="22"/>
-          <w:szCs w:val="22"/>
-        </w:rPr>
-        <w:t xml:space="preserve">☐  Sim     ☐  Não     ☐  Não consegui verificar</w:t>
+        <w:rPr/>
+        <w:t>☒ Sim     ☐ Não     ☐ Não consegui verificar</w:t>
       </w:r>
     </w:p>
     <w:p>
@@ -1674,22 +1680,7 @@
           </w:tcPr>
           <w:p>
             <w:r>
-              <w:rPr>
-                <w:rFonts w:ascii="Calibri" w:cs="Calibri" w:eastAsia="Calibri" w:hAnsi="Calibri"/>
-                <w:sz w:val="22"/>
-                <w:szCs w:val="22"/>
-              </w:rPr>
-              <w:t xml:space="preserve">☐ Sim</w:t>
-            </w:r>
-          </w:p>
-          <w:p>
-            <w:r>
-              <w:rPr>
-                <w:rFonts w:ascii="Calibri" w:cs="Calibri" w:eastAsia="Calibri" w:hAnsi="Calibri"/>
-                <w:sz w:val="22"/>
-                <w:szCs w:val="22"/>
-              </w:rPr>
-              <w:t xml:space="preserve">☐ Não</w:t>
+              <w:t>☒ Sim  ☐ Não</w:t>
             </w:r>
           </w:p>
         </w:tc>
@@ -1798,22 +1789,7 @@
           </w:tcPr>
           <w:p>
             <w:r>
-              <w:rPr>
-                <w:rFonts w:ascii="Calibri" w:cs="Calibri" w:eastAsia="Calibri" w:hAnsi="Calibri"/>
-                <w:sz w:val="22"/>
-                <w:szCs w:val="22"/>
-              </w:rPr>
-              <w:t xml:space="preserve">☐ Sim</w:t>
-            </w:r>
-          </w:p>
-          <w:p>
-            <w:r>
-              <w:rPr>
-                <w:rFonts w:ascii="Calibri" w:cs="Calibri" w:eastAsia="Calibri" w:hAnsi="Calibri"/>
-                <w:sz w:val="22"/>
-                <w:szCs w:val="22"/>
-              </w:rPr>
-              <w:t xml:space="preserve">☐ Não</w:t>
+              <w:t>☒ Sim  ☐ Não</w:t>
             </w:r>
           </w:p>
         </w:tc>
@@ -1922,22 +1898,7 @@
           </w:tcPr>
           <w:p>
             <w:r>
-              <w:rPr>
-                <w:rFonts w:ascii="Calibri" w:cs="Calibri" w:eastAsia="Calibri" w:hAnsi="Calibri"/>
-                <w:sz w:val="22"/>
-                <w:szCs w:val="22"/>
-              </w:rPr>
-              <w:t xml:space="preserve">☐ Sim</w:t>
-            </w:r>
-          </w:p>
-          <w:p>
-            <w:r>
-              <w:rPr>
-                <w:rFonts w:ascii="Calibri" w:cs="Calibri" w:eastAsia="Calibri" w:hAnsi="Calibri"/>
-                <w:sz w:val="22"/>
-                <w:szCs w:val="22"/>
-              </w:rPr>
-              <w:t xml:space="preserve">☐ Não</w:t>
+              <w:t>☒ Sim  ☐ Não</w:t>
             </w:r>
           </w:p>
         </w:tc>
@@ -1957,6 +1918,11 @@
           <w:szCs w:val="22"/>
         </w:rPr>
         <w:t xml:space="preserve">c) Qual é a situação desta norma hoje?</w:t>
+      </w:r>
+    </w:p>
+    <w:p>
+      <w:r>
+        <w:t>RESPOSTA: Vigente com alterações conhecidas. O CFESS disponibiliza edição compilada e o PDF recebido registra as Resoluções 938/2020 e 1.013/2022. A Resolução 988/2022 disciplina atos eletrônicos. A pesquisa realizada não permite afirmar de modo exaustivo que não existam outras alterações ou decisões judiciais.</w:t>
       </w:r>
     </w:p>
     <w:p>
@@ -2052,12 +2018,8 @@
         <w:spacing w:after="100"/>
       </w:pPr>
       <w:r>
-        <w:rPr>
-          <w:rFonts w:ascii="Calibri" w:cs="Calibri" w:eastAsia="Calibri" w:hAnsi="Calibri"/>
-          <w:sz w:val="22"/>
-          <w:szCs w:val="22"/>
-        </w:rPr>
-        <w:t xml:space="preserve">☐  Vigente     ☐  Vigente com alterações     ☐  Revogada     ☐  Suspensa ou invalidada     ☐  Não sei</w:t>
+        <w:rPr/>
+        <w:t>☐ Vigente     ☒ Vigente com alterações     ☐ Revogada     ☐ Suspensa ou invalidada     ☐ Não sei</w:t>
       </w:r>
     </w:p>
     <w:tbl>
@@ -2095,35 +2057,11 @@
           </w:tcPr>
           <w:p>
             <w:r>
-              <w:rPr>
-                <w:rFonts w:ascii="Calibri" w:cs="Calibri" w:eastAsia="Calibri" w:hAnsi="Calibri"/>
-                <w:i/>
-                <w:iCs/>
-                <w:color w:val="4F5D70"/>
-                <w:sz w:val="22"/>
-                <w:szCs w:val="22"/>
-              </w:rPr>
-              <w:t xml:space="preserve">Se alterada, revogada ou suspensa: por qual norma e em quê (se souber):</w:t>
-            </w:r>
-          </w:p>
-          <w:p>
-            <w:r>
-              <w:rPr>
-                <w:rFonts w:ascii="Calibri" w:cs="Calibri" w:eastAsia="Calibri" w:hAnsi="Calibri"/>
-                <w:sz w:val="22"/>
-                <w:szCs w:val="22"/>
-              </w:rPr>
-              <w:t xml:space="preserve"/>
-            </w:r>
-          </w:p>
-          <w:p>
-            <w:r>
-              <w:rPr>
-                <w:rFonts w:ascii="Calibri" w:cs="Calibri" w:eastAsia="Calibri" w:hAnsi="Calibri"/>
-                <w:sz w:val="22"/>
-                <w:szCs w:val="22"/>
-              </w:rPr>
-              <w:t xml:space="preserve"/>
+              <w:t>Se alterada, revogada ou suspensa: por qual norma e em quê (se souber):</w:t>
+              <w:br/>
+              <w:t>Resolução 938/2020: o PDF compilado registra nova redação do art. 15, § 2º, sobre contagem em dias úteis, e alterações dos arts. 74 e 75 sobre prescrição. Resolução 1.013/2022: o PDF registra a inclusão do art. 76 e renumeração dos artigos seguintes. Resolução 988/2022: disciplina a realização de atos e ritos eletrônicos, virtuais ou híbridos, com condições específicas; trata também das Resoluções 657/2013 e 660/2013.</w:t>
+              <w:br/>
+              <w:t>Fontes: PDF compilado da Resolução 660/2013, páginas 6, 18 e 19; https://www.cfess.org.br/arquivos/ResolucaoCfess988-2022.pdf (arts. 4º e 5º); https://www.cfess.org.br/legislacao/view/581/resolucao-n6602013. Não foi concluída pesquisa exaustiva de atos ou decisões posteriores.</w:t>
             </w:r>
           </w:p>
         </w:tc>
@@ -2350,22 +2288,7 @@
           </w:tcPr>
           <w:p>
             <w:r>
-              <w:rPr>
-                <w:rFonts w:ascii="Calibri" w:cs="Calibri" w:eastAsia="Calibri" w:hAnsi="Calibri"/>
-                <w:sz w:val="22"/>
-                <w:szCs w:val="22"/>
-              </w:rPr>
-              <w:t xml:space="preserve">☐ Sim</w:t>
-            </w:r>
-          </w:p>
-          <w:p>
-            <w:r>
-              <w:rPr>
-                <w:rFonts w:ascii="Calibri" w:cs="Calibri" w:eastAsia="Calibri" w:hAnsi="Calibri"/>
-                <w:sz w:val="22"/>
-                <w:szCs w:val="22"/>
-              </w:rPr>
-              <w:t xml:space="preserve">☐ Não</w:t>
+              <w:t>☒ Sim. Redação antiga do art. 15, § 2º, está riscada; foi substituída pela contagem em dias úteis (Res. 938/2020).</w:t>
             </w:r>
           </w:p>
         </w:tc>
@@ -2447,22 +2370,7 @@
           </w:tcPr>
           <w:p>
             <w:r>
-              <w:rPr>
-                <w:rFonts w:ascii="Calibri" w:cs="Calibri" w:eastAsia="Calibri" w:hAnsi="Calibri"/>
-                <w:sz w:val="22"/>
-                <w:szCs w:val="22"/>
-              </w:rPr>
-              <w:t xml:space="preserve">☐ Sim</w:t>
-            </w:r>
-          </w:p>
-          <w:p>
-            <w:r>
-              <w:rPr>
-                <w:rFonts w:ascii="Calibri" w:cs="Calibri" w:eastAsia="Calibri" w:hAnsi="Calibri"/>
-                <w:sz w:val="22"/>
-                <w:szCs w:val="22"/>
-              </w:rPr>
-              <w:t xml:space="preserve">☐ Não</w:t>
+              <w:t>☒ Sim. Ambos estão riscados: o antigo parágrafo único do art. 74 foi renumerado como § 1º; a redação do art. 75 com prazo de dois anos foi substituída pela de três anos (Res. 938/2020).</w:t>
             </w:r>
           </w:p>
         </w:tc>
@@ -2519,25 +2427,9 @@
           </w:tcPr>
           <w:p>
             <w:r>
-              <w:rPr>
-                <w:rFonts w:ascii="Calibri" w:cs="Calibri" w:eastAsia="Calibri" w:hAnsi="Calibri"/>
-                <w:i/>
-                <w:iCs/>
-                <w:color w:val="4F5D70"/>
-                <w:sz w:val="22"/>
-                <w:szCs w:val="22"/>
-              </w:rPr>
-              <w:t xml:space="preserve">Algo a corrigir ou registrar sobre este documento:</w:t>
-            </w:r>
-          </w:p>
-          <w:p>
-            <w:r>
-              <w:rPr>
-                <w:rFonts w:ascii="Calibri" w:cs="Calibri" w:eastAsia="Calibri" w:hAnsi="Calibri"/>
-                <w:sz w:val="22"/>
-                <w:szCs w:val="22"/>
-              </w:rPr>
-              <w:t xml:space="preserve"/>
+              <w:t>Algo a corrigir ou registrar sobre este documento:</w:t>
+              <w:br/>
+              <w:t>O trecho da página 18 reúne duas disposições distintas: o antigo parágrafo único do art. 74, renumerado, e a redação anterior do art. 75. A extração juntou as palavras e suprimiu a separação entre eles. O PDF compilado mantém os textos antigos riscados para registro; eles não devem ser apresentados como redação atual. Fonte: PDF compilado da Resolução 660/2013 recebido para a conferência, páginas 6 e 18.</w:t>
             </w:r>
           </w:p>
         </w:tc>
@@ -2590,7 +2482,7 @@
         </w:rPr>
         <w:t xml:space="preserve">PDF oficial: </w:t>
       </w:r>
-      <w:hyperlink w:history="1" r:id="rIdwnusfji5dbsi-52t3gctp">
+      <w:hyperlink w:history="1" r:id="rIdrbn2uxaciiyfhytluv3yd">
         <w:r>
           <w:rPr>
             <w:rFonts w:ascii="Calibri" w:cs="Calibri" w:eastAsia="Calibri" w:hAnsi="Calibri"/>
@@ -2610,7 +2502,7 @@
         </w:rPr>
         <w:t xml:space="preserve">   ·   </w:t>
       </w:r>
-      <w:hyperlink w:history="1" r:id="rIdw-_fxt95fye74vf66b6x-">
+      <w:hyperlink w:history="1" r:id="rIdl0fnjhcyijixs_gwbuekp">
         <w:r>
           <w:rPr>
             <w:rFonts w:ascii="Calibri" w:cs="Calibri" w:eastAsia="Calibri" w:hAnsi="Calibri"/>
@@ -2637,6 +2529,16 @@
           <w:szCs w:val="22"/>
         </w:rPr>
         <w:t xml:space="preserve">a) O PDF é o documento oficial e está completo?</w:t>
+      </w:r>
+    </w:p>
+    <w:p>
+      <w:r>
+        <w:rPr>
+          <w:b/>
+          <w:color w:val="174F70"/>
+          <w:sz w:val="20"/>
+        </w:rPr>
+        <w:t>RESPOSTA: Sim. PDF oficial de 10 páginas; contém a resolução e o Código Processual Disciplinar, com texto compilado e retificação.</w:t>
       </w:r>
     </w:p>
     <w:p>
@@ -2919,22 +2821,7 @@
           </w:tcPr>
           <w:p>
             <w:r>
-              <w:rPr>
-                <w:rFonts w:ascii="Calibri" w:cs="Calibri" w:eastAsia="Calibri" w:hAnsi="Calibri"/>
-                <w:sz w:val="22"/>
-                <w:szCs w:val="22"/>
-              </w:rPr>
-              <w:t xml:space="preserve">☐ Sim</w:t>
-            </w:r>
-          </w:p>
-          <w:p>
-            <w:r>
-              <w:rPr>
-                <w:rFonts w:ascii="Calibri" w:cs="Calibri" w:eastAsia="Calibri" w:hAnsi="Calibri"/>
-                <w:sz w:val="22"/>
-                <w:szCs w:val="22"/>
-              </w:rPr>
-              <w:t xml:space="preserve">☐ Não</w:t>
+              <w:t>Sim.</w:t>
             </w:r>
           </w:p>
         </w:tc>
@@ -3043,22 +2930,7 @@
           </w:tcPr>
           <w:p>
             <w:r>
-              <w:rPr>
-                <w:rFonts w:ascii="Calibri" w:cs="Calibri" w:eastAsia="Calibri" w:hAnsi="Calibri"/>
-                <w:sz w:val="22"/>
-                <w:szCs w:val="22"/>
-              </w:rPr>
-              <w:t xml:space="preserve">☐ Sim</w:t>
-            </w:r>
-          </w:p>
-          <w:p>
-            <w:r>
-              <w:rPr>
-                <w:rFonts w:ascii="Calibri" w:cs="Calibri" w:eastAsia="Calibri" w:hAnsi="Calibri"/>
-                <w:sz w:val="22"/>
-                <w:szCs w:val="22"/>
-              </w:rPr>
-              <w:t xml:space="preserve">☐ Não</w:t>
+              <w:t>Sim.</w:t>
             </w:r>
           </w:p>
         </w:tc>
@@ -3167,22 +3039,7 @@
           </w:tcPr>
           <w:p>
             <w:r>
-              <w:rPr>
-                <w:rFonts w:ascii="Calibri" w:cs="Calibri" w:eastAsia="Calibri" w:hAnsi="Calibri"/>
-                <w:sz w:val="22"/>
-                <w:szCs w:val="22"/>
-              </w:rPr>
-              <w:t xml:space="preserve">☐ Sim</w:t>
-            </w:r>
-          </w:p>
-          <w:p>
-            <w:r>
-              <w:rPr>
-                <w:rFonts w:ascii="Calibri" w:cs="Calibri" w:eastAsia="Calibri" w:hAnsi="Calibri"/>
-                <w:sz w:val="22"/>
-                <w:szCs w:val="22"/>
-              </w:rPr>
-              <w:t xml:space="preserve">☐ Não</w:t>
+              <w:t>Sim.</w:t>
             </w:r>
           </w:p>
         </w:tc>
@@ -3202,6 +3059,11 @@
           <w:szCs w:val="22"/>
         </w:rPr>
         <w:t xml:space="preserve">c) Qual é a situação desta norma hoje?</w:t>
+      </w:r>
+    </w:p>
+    <w:p>
+      <w:r>
+        <w:t>RESPOSTA: Vigente, conforme a edição compilada disponibilizada pelo CFESS, com retificação conhecida do art. 30. A Resolução 988/2022 disciplina atos eletrônicos aplicáveis aos processos previstos na 657/2013. A pesquisa não foi exaustiva quanto a atos ou decisões posteriores.</w:t>
       </w:r>
     </w:p>
     <w:p>
@@ -3261,12 +3123,7 @@
         <w:spacing w:after="100"/>
       </w:pPr>
       <w:r>
-        <w:rPr>
-          <w:rFonts w:ascii="Calibri" w:cs="Calibri" w:eastAsia="Calibri" w:hAnsi="Calibri"/>
-          <w:sz w:val="22"/>
-          <w:szCs w:val="22"/>
-        </w:rPr>
-        <w:t xml:space="preserve">☐  Vigente     ☐  Vigente com alterações     ☐  Revogada     ☐  Suspensa ou invalidada     ☐  Não sei</w:t>
+        <w:t>☒ Vigente     ☐ Vigente com alterações     ☐ Revogada     ☐ Suspensa ou invalidada     ☐ Não sei</w:t>
       </w:r>
     </w:p>
     <w:tbl>
@@ -3304,35 +3161,11 @@
           </w:tcPr>
           <w:p>
             <w:r>
-              <w:rPr>
-                <w:rFonts w:ascii="Calibri" w:cs="Calibri" w:eastAsia="Calibri" w:hAnsi="Calibri"/>
-                <w:i/>
-                <w:iCs/>
-                <w:color w:val="4F5D70"/>
-                <w:sz w:val="22"/>
-                <w:szCs w:val="22"/>
-              </w:rPr>
-              <w:t xml:space="preserve">Se alterada, revogada ou suspensa: por qual norma e em quê (se souber):</w:t>
-            </w:r>
-          </w:p>
-          <w:p>
-            <w:r>
-              <w:rPr>
-                <w:rFonts w:ascii="Calibri" w:cs="Calibri" w:eastAsia="Calibri" w:hAnsi="Calibri"/>
-                <w:sz w:val="22"/>
-                <w:szCs w:val="22"/>
-              </w:rPr>
-              <w:t xml:space="preserve"/>
-            </w:r>
-          </w:p>
-          <w:p>
-            <w:r>
-              <w:rPr>
-                <w:rFonts w:ascii="Calibri" w:cs="Calibri" w:eastAsia="Calibri" w:hAnsi="Calibri"/>
-                <w:sz w:val="22"/>
-                <w:szCs w:val="22"/>
-              </w:rPr>
-              <w:t xml:space="preserve"/>
+              <w:t>Se alterada, revogada ou suspensa: por qual norma e em quê (se souber):</w:t>
+              <w:br/>
+              <w:t>O parágrafo único do art. 30 foi republicado para retificação em 26/05/2015: a redação corrigida menciona os incisos I, II e IV do art. 2º; a redação anterior com I, IV e V aparece riscada no compilado. A Resolução 988/2022 disciplina atos e ritos eletrônicos, virtuais ou híbridos para os processos das Resoluções 657/2013 e 660/2013; é norma de procedimento relacionada, sem que isso implique alteração textual direta da 657. Não foi feita pesquisa exaustiva de atos e decisões posteriores.</w:t>
+              <w:br/>
+              <w:t>Fontes: https://www.cfess.org.br/uploads/legislacao/5739/657-2013%20(compilada).pdf (p. 9) e https://www.cfess.org.br/arquivos/ResolucaoCfess988-2022.pdf (arts. 4º e 5º).</w:t>
             </w:r>
           </w:p>
         </w:tc>
@@ -3559,22 +3392,7 @@
           </w:tcPr>
           <w:p>
             <w:r>
-              <w:rPr>
-                <w:rFonts w:ascii="Calibri" w:cs="Calibri" w:eastAsia="Calibri" w:hAnsi="Calibri"/>
-                <w:sz w:val="22"/>
-                <w:szCs w:val="22"/>
-              </w:rPr>
-              <w:t xml:space="preserve">☐ Sim</w:t>
-            </w:r>
-          </w:p>
-          <w:p>
-            <w:r>
-              <w:rPr>
-                <w:rFonts w:ascii="Calibri" w:cs="Calibri" w:eastAsia="Calibri" w:hAnsi="Calibri"/>
-                <w:sz w:val="22"/>
-                <w:szCs w:val="22"/>
-              </w:rPr>
-              <w:t xml:space="preserve">☐ Não</w:t>
+              <w:t>Sim. A primeira redação está riscada; abaixo, consta a retificação com incisos I, II e IV, publicada em 26/05/2015.</w:t>
             </w:r>
           </w:p>
         </w:tc>
@@ -3652,6 +3470,11 @@
               <w:t xml:space="preserve"/>
             </w:r>
           </w:p>
+          <w:p>
+            <w:r>
+              <w:t>RESPOSTA: Ver tabela de comparação; fonte: https://www.cfess.org.br/uploads/legislacao/5739/657-2013%20%28compilada%29.pdf</w:t>
+            </w:r>
+          </w:p>
         </w:tc>
       </w:tr>
     </w:tbl>
@@ -3702,7 +3525,7 @@
         </w:rPr>
         <w:t xml:space="preserve">PDF oficial: </w:t>
       </w:r>
-      <w:hyperlink w:history="1" r:id="rIdxklaovak7adrq6j1ks2u_">
+      <w:hyperlink w:history="1" r:id="rIddlxzhli37xxwslsjm9fju">
         <w:r>
           <w:rPr>
             <w:rFonts w:ascii="Calibri" w:cs="Calibri" w:eastAsia="Calibri" w:hAnsi="Calibri"/>
@@ -3722,7 +3545,7 @@
         </w:rPr>
         <w:t xml:space="preserve">   ·   </w:t>
       </w:r>
-      <w:hyperlink w:history="1" r:id="rIdhuc0-m5kjktcyhpc9zhpb">
+      <w:hyperlink w:history="1" r:id="rIdcwxfefby07_10viehpnyn">
         <w:r>
           <w:rPr>
             <w:rFonts w:ascii="Calibri" w:cs="Calibri" w:eastAsia="Calibri" w:hAnsi="Calibri"/>
@@ -3749,6 +3572,16 @@
           <w:szCs w:val="22"/>
         </w:rPr>
         <w:t xml:space="preserve">a) O PDF é o documento oficial e está completo?</w:t>
+      </w:r>
+    </w:p>
+    <w:p>
+      <w:r>
+        <w:rPr>
+          <w:b/>
+          <w:color w:val="174F70"/>
+          <w:sz w:val="20"/>
+        </w:rPr>
+        <w:t>RESPOSTA: Sim. PDF oficial de 6 páginas, da identificação à assinatura e publicação.</w:t>
       </w:r>
     </w:p>
     <w:p>
@@ -4031,22 +3864,7 @@
           </w:tcPr>
           <w:p>
             <w:r>
-              <w:rPr>
-                <w:rFonts w:ascii="Calibri" w:cs="Calibri" w:eastAsia="Calibri" w:hAnsi="Calibri"/>
-                <w:sz w:val="22"/>
-                <w:szCs w:val="22"/>
-              </w:rPr>
-              <w:t xml:space="preserve">☐ Sim</w:t>
-            </w:r>
-          </w:p>
-          <w:p>
-            <w:r>
-              <w:rPr>
-                <w:rFonts w:ascii="Calibri" w:cs="Calibri" w:eastAsia="Calibri" w:hAnsi="Calibri"/>
-                <w:sz w:val="22"/>
-                <w:szCs w:val="22"/>
-              </w:rPr>
-              <w:t xml:space="preserve">☐ Não</w:t>
+              <w:t>Sim.</w:t>
             </w:r>
           </w:p>
         </w:tc>
@@ -4155,22 +3973,7 @@
           </w:tcPr>
           <w:p>
             <w:r>
-              <w:rPr>
-                <w:rFonts w:ascii="Calibri" w:cs="Calibri" w:eastAsia="Calibri" w:hAnsi="Calibri"/>
-                <w:sz w:val="22"/>
-                <w:szCs w:val="22"/>
-              </w:rPr>
-              <w:t xml:space="preserve">☐ Sim</w:t>
-            </w:r>
-          </w:p>
-          <w:p>
-            <w:r>
-              <w:rPr>
-                <w:rFonts w:ascii="Calibri" w:cs="Calibri" w:eastAsia="Calibri" w:hAnsi="Calibri"/>
-                <w:sz w:val="22"/>
-                <w:szCs w:val="22"/>
-              </w:rPr>
-              <w:t xml:space="preserve">☐ Não</w:t>
+              <w:t>Sim.</w:t>
             </w:r>
           </w:p>
         </w:tc>
@@ -4279,22 +4082,7 @@
           </w:tcPr>
           <w:p>
             <w:r>
-              <w:rPr>
-                <w:rFonts w:ascii="Calibri" w:cs="Calibri" w:eastAsia="Calibri" w:hAnsi="Calibri"/>
-                <w:sz w:val="22"/>
-                <w:szCs w:val="22"/>
-              </w:rPr>
-              <w:t xml:space="preserve">☐ Sim</w:t>
-            </w:r>
-          </w:p>
-          <w:p>
-            <w:r>
-              <w:rPr>
-                <w:rFonts w:ascii="Calibri" w:cs="Calibri" w:eastAsia="Calibri" w:hAnsi="Calibri"/>
-                <w:sz w:val="22"/>
-                <w:szCs w:val="22"/>
-              </w:rPr>
-              <w:t xml:space="preserve">☐ Não</w:t>
+              <w:t>Sim.</w:t>
             </w:r>
           </w:p>
         </w:tc>
@@ -4314,6 +4102,11 @@
           <w:szCs w:val="22"/>
         </w:rPr>
         <w:t xml:space="preserve">c) Qual é a situação desta norma hoje?</w:t>
+      </w:r>
+    </w:p>
+    <w:p>
+      <w:r>
+        <w:t>RESPOSTA: Vigente, segundo as fontes institucionais consultadas: o CFESS disponibiliza a resolução e o CRESS-SP a indica para o pedido de desagravo público. Não foi localizada norma posterior de alteração ou revogação na pesquisa realizada; essa busca não é prova exaustiva de inexistência de decisões ou atos posteriores.</w:t>
       </w:r>
     </w:p>
     <w:p>
@@ -4373,12 +4166,7 @@
         <w:spacing w:after="100"/>
       </w:pPr>
       <w:r>
-        <w:rPr>
-          <w:rFonts w:ascii="Calibri" w:cs="Calibri" w:eastAsia="Calibri" w:hAnsi="Calibri"/>
-          <w:sz w:val="22"/>
-          <w:szCs w:val="22"/>
-        </w:rPr>
-        <w:t xml:space="preserve">☐  Vigente     ☐  Vigente com alterações     ☐  Revogada     ☐  Suspensa ou invalidada     ☐  Não sei</w:t>
+        <w:t>☒ Vigente     ☐ Vigente com alterações     ☐ Revogada     ☐ Suspensa ou invalidada     ☐ Não sei</w:t>
       </w:r>
     </w:p>
     <w:tbl>
@@ -4416,35 +4204,9 @@
           </w:tcPr>
           <w:p>
             <w:r>
-              <w:rPr>
-                <w:rFonts w:ascii="Calibri" w:cs="Calibri" w:eastAsia="Calibri" w:hAnsi="Calibri"/>
-                <w:i/>
-                <w:iCs/>
-                <w:color w:val="4F5D70"/>
-                <w:sz w:val="22"/>
-                <w:szCs w:val="22"/>
-              </w:rPr>
-              <w:t xml:space="preserve">Se alterada, revogada ou suspensa: por qual norma e em quê (se souber):</w:t>
-            </w:r>
-          </w:p>
-          <w:p>
-            <w:r>
-              <w:rPr>
-                <w:rFonts w:ascii="Calibri" w:cs="Calibri" w:eastAsia="Calibri" w:hAnsi="Calibri"/>
-                <w:sz w:val="22"/>
-                <w:szCs w:val="22"/>
-              </w:rPr>
-              <w:t xml:space="preserve"/>
-            </w:r>
-          </w:p>
-          <w:p>
-            <w:r>
-              <w:rPr>
-                <w:rFonts w:ascii="Calibri" w:cs="Calibri" w:eastAsia="Calibri" w:hAnsi="Calibri"/>
-                <w:sz w:val="22"/>
-                <w:szCs w:val="22"/>
-              </w:rPr>
-              <w:t xml:space="preserve"/>
+              <w:t>Se alterada, revogada ou suspensa: por qual norma e em quê (se souber):</w:t>
+              <w:br/>
+              <w:t>Não foi identificada alteração, revogação ou suspensão da Resolução 1.073/2024 na pesquisa realizada. Seu art. 13 revoga a Resolução 443/2003; trata-se de revogação da norma anterior, não da 1.073/2024. Fontes: https://www.cfess.org.br/uploads/legislacao/4283/1073-2024.pdf e https://cress-sp.org.br/servico/view/20/pedido-de-desagravo-publico. A busca não esgota eventuais atos ou decisões posteriores.</w:t>
             </w:r>
           </w:p>
         </w:tc>
@@ -4522,6 +4284,11 @@
               <w:t xml:space="preserve"/>
             </w:r>
           </w:p>
+          <w:p>
+            <w:r>
+              <w:t>RESPOSTA: O art. 11 corresponde ao trecho exibido; há parágrafos subsequentes no PDF. Fonte: https://www.cfess.org.br/uploads/legislacao/4283/1073-2024.pdf</w:t>
+            </w:r>
+          </w:p>
         </w:tc>
       </w:tr>
     </w:tbl>
@@ -4572,7 +4339,7 @@
         </w:rPr>
         <w:t xml:space="preserve">PDF oficial: </w:t>
       </w:r>
-      <w:hyperlink w:history="1" r:id="rIddjiywemrdlvpdcxsixnyk">
+      <w:hyperlink w:history="1" r:id="rIdttqmq0ofyjnwu4swztv5o">
         <w:r>
           <w:rPr>
             <w:rFonts w:ascii="Calibri" w:cs="Calibri" w:eastAsia="Calibri" w:hAnsi="Calibri"/>
@@ -4592,7 +4359,7 @@
         </w:rPr>
         <w:t xml:space="preserve">   ·   </w:t>
       </w:r>
-      <w:hyperlink w:history="1" r:id="rIdbm__akrlssejpthffzdby">
+      <w:hyperlink w:history="1" r:id="rIdggvtv90c-pf8uj2hnievn">
         <w:r>
           <w:rPr>
             <w:rFonts w:ascii="Calibri" w:cs="Calibri" w:eastAsia="Calibri" w:hAnsi="Calibri"/>
@@ -4622,16 +4389,18 @@
       </w:r>
     </w:p>
     <w:p>
+      <w:r>
+        <w:rPr/>
+        <w:t>RESPOSTA: O arquivo recebido tem quatro páginas e contém a resolução da ementa até a assinatura e a indicação de publicação no DOU; a quarta página contém apenas rodapé. A página oficial do CFESS identifica um anexo com o mesmo nome. Não foi realizada comparação de autenticidade entre os arquivos.</w:t>
+      </w:r>
+    </w:p>
+    <w:p>
       <w:pPr>
         <w:spacing w:after="100"/>
       </w:pPr>
       <w:r>
-        <w:rPr>
-          <w:rFonts w:ascii="Calibri" w:cs="Calibri" w:eastAsia="Calibri" w:hAnsi="Calibri"/>
-          <w:sz w:val="22"/>
-          <w:szCs w:val="22"/>
-        </w:rPr>
-        <w:t xml:space="preserve">☐  Sim     ☐  Não     ☐  Não consegui verificar</w:t>
+        <w:rPr/>
+        <w:t>☒ Sim, quanto ao conteúdo da resolução     ☐ Não     ☐ Não consegui verificar</w:t>
       </w:r>
     </w:p>
     <w:p>
@@ -4901,22 +4670,8 @@
           </w:tcPr>
           <w:p>
             <w:r>
-              <w:rPr>
-                <w:rFonts w:ascii="Calibri" w:cs="Calibri" w:eastAsia="Calibri" w:hAnsi="Calibri"/>
-                <w:sz w:val="22"/>
-                <w:szCs w:val="22"/>
-              </w:rPr>
-              <w:t xml:space="preserve">☐ Sim</w:t>
-            </w:r>
-          </w:p>
-          <w:p>
-            <w:r>
-              <w:rPr>
-                <w:rFonts w:ascii="Calibri" w:cs="Calibri" w:eastAsia="Calibri" w:hAnsi="Calibri"/>
-                <w:sz w:val="22"/>
-                <w:szCs w:val="22"/>
-              </w:rPr>
-              <w:t xml:space="preserve">☐ Não</w:t>
+              <w:rPr/>
+              <w:t>☐ Sim  ☒ Não, como exibido: o trecho termina em reticências, antes do fim do artigo. A parte visível corresponde ao PDF.</w:t>
             </w:r>
           </w:p>
         </w:tc>
@@ -5025,22 +4780,8 @@
           </w:tcPr>
           <w:p>
             <w:r>
-              <w:rPr>
-                <w:rFonts w:ascii="Calibri" w:cs="Calibri" w:eastAsia="Calibri" w:hAnsi="Calibri"/>
-                <w:sz w:val="22"/>
-                <w:szCs w:val="22"/>
-              </w:rPr>
-              <w:t xml:space="preserve">☐ Sim</w:t>
-            </w:r>
-          </w:p>
-          <w:p>
-            <w:r>
-              <w:rPr>
-                <w:rFonts w:ascii="Calibri" w:cs="Calibri" w:eastAsia="Calibri" w:hAnsi="Calibri"/>
-                <w:sz w:val="22"/>
-                <w:szCs w:val="22"/>
-              </w:rPr>
-              <w:t xml:space="preserve">☐ Não</w:t>
+              <w:rPr/>
+              <w:t>☐ Sim  ☒ Não, como exibido: o trecho está interrompido na alínea b. A parte visível corresponde ao PDF.</w:t>
             </w:r>
           </w:p>
         </w:tc>
@@ -5149,22 +4890,7 @@
           </w:tcPr>
           <w:p>
             <w:r>
-              <w:rPr>
-                <w:rFonts w:ascii="Calibri" w:cs="Calibri" w:eastAsia="Calibri" w:hAnsi="Calibri"/>
-                <w:sz w:val="22"/>
-                <w:szCs w:val="22"/>
-              </w:rPr>
-              <w:t xml:space="preserve">☐ Sim</w:t>
-            </w:r>
-          </w:p>
-          <w:p>
-            <w:r>
-              <w:rPr>
-                <w:rFonts w:ascii="Calibri" w:cs="Calibri" w:eastAsia="Calibri" w:hAnsi="Calibri"/>
-                <w:sz w:val="22"/>
-                <w:szCs w:val="22"/>
-              </w:rPr>
-              <w:t xml:space="preserve">☐ Não</w:t>
+              <w:t>☒ Sim  ☐ Não</w:t>
             </w:r>
           </w:p>
         </w:tc>
@@ -5184,6 +4910,14 @@
           <w:szCs w:val="22"/>
         </w:rPr>
         <w:t xml:space="preserve">c) Qual é a situação desta norma hoje?</w:t>
+      </w:r>
+    </w:p>
+    <w:p>
+      <w:r>
+        <w:rPr>
+          <w:highlight w:val="red"/>
+        </w:rPr>
+        <w:t>RESPOSTA: Não sei com segurança. A resolução consta do catálogo do CFESS, e não foi identificada norma posterior específica na pesquisa realizada. O catálogo não explicita a vigência nem afasta por si só revogação tácita ou decisão judicial. O documento DocsCPE2026.pdf indicado não pôde ser acessado para verificar a referência.</w:t>
       </w:r>
     </w:p>
     <w:p>
@@ -5225,12 +4959,8 @@
         <w:spacing w:after="100"/>
       </w:pPr>
       <w:r>
-        <w:rPr>
-          <w:rFonts w:ascii="Calibri" w:cs="Calibri" w:eastAsia="Calibri" w:hAnsi="Calibri"/>
-          <w:sz w:val="22"/>
-          <w:szCs w:val="22"/>
-        </w:rPr>
-        <w:t xml:space="preserve">☐  Vigente     ☐  Vigente com alterações     ☐  Revogada     ☐  Suspensa ou invalidada     ☐  Não sei</w:t>
+        <w:rPr/>
+        <w:t>☐ Vigente     ☐ Vigente com alterações     ☐ Revogada     ☐ Suspensa ou invalidada     ☒ Não sei</w:t>
       </w:r>
     </w:p>
     <w:tbl>
@@ -5269,34 +4999,11 @@
           <w:p>
             <w:r>
               <w:rPr>
-                <w:rFonts w:ascii="Calibri" w:cs="Calibri" w:eastAsia="Calibri" w:hAnsi="Calibri"/>
-                <w:i/>
-                <w:iCs/>
-                <w:color w:val="4F5D70"/>
-                <w:sz w:val="22"/>
-                <w:szCs w:val="22"/>
-              </w:rPr>
-              <w:t xml:space="preserve">Se alterada, revogada ou suspensa: por qual norma e em quê (se souber):</w:t>
-            </w:r>
-          </w:p>
-          <w:p>
-            <w:r>
-              <w:rPr>
-                <w:rFonts w:ascii="Calibri" w:cs="Calibri" w:eastAsia="Calibri" w:hAnsi="Calibri"/>
-                <w:sz w:val="22"/>
-                <w:szCs w:val="22"/>
-              </w:rPr>
-              <w:t xml:space="preserve"/>
-            </w:r>
-          </w:p>
-          <w:p>
-            <w:r>
-              <w:rPr>
-                <w:rFonts w:ascii="Calibri" w:cs="Calibri" w:eastAsia="Calibri" w:hAnsi="Calibri"/>
-                <w:sz w:val="22"/>
-                <w:szCs w:val="22"/>
-              </w:rPr>
-              <w:t xml:space="preserve"/>
+                <w:highlight w:val="red"/>
+              </w:rPr>
+              <w:t>Se alterada, revogada ou suspensa: por qual norma e em quê (se souber):</w:t>
+              <w:br/>
+              <w:t>Não identificada na pesquisa realizada. A página https://www.cfess.org.br/legislacao/view/333/resolucao-n-9522020 identifica a resolução, mas não comprova por si só a ausência de atos posteriores. A fonte adicional indicada https://cfess.org.br/uploads/documento/5859/DocsCPE2026.pdf não pôde ser aberta; confirmar seu conteúdo antes de usá-la.</w:t>
             </w:r>
           </w:p>
         </w:tc>
@@ -5353,25 +5060,10 @@
           </w:tcPr>
           <w:p>
             <w:r>
-              <w:rPr>
-                <w:rFonts w:ascii="Calibri" w:cs="Calibri" w:eastAsia="Calibri" w:hAnsi="Calibri"/>
-                <w:i/>
-                <w:iCs/>
-                <w:color w:val="4F5D70"/>
-                <w:sz w:val="22"/>
-                <w:szCs w:val="22"/>
-              </w:rPr>
-              <w:t xml:space="preserve">Algo a corrigir ou registrar sobre este documento:</w:t>
-            </w:r>
-          </w:p>
-          <w:p>
-            <w:r>
-              <w:rPr>
-                <w:rFonts w:ascii="Calibri" w:cs="Calibri" w:eastAsia="Calibri" w:hAnsi="Calibri"/>
-                <w:sz w:val="22"/>
-                <w:szCs w:val="22"/>
-              </w:rPr>
-              <w:t xml:space="preserve"/>
+              <w:rPr/>
+              <w:t>Algo a corrigir ou registrar sobre este documento:</w:t>
+              <w:br/>
+              <w:t>Os trechos dos artigos 1º e 5º exibidos na tabela estão abreviados com reticências; não é possível concluir, apenas por essa exibição, se o sistema armazenou os artigos completos. No PDF, o artigo 1º termina com: “Diário Oficial da União nº 205, de 22 de outubro de 2013, Seção 1.” Na alínea b do art. 5º, após “pena básica com o”, segue: “seu agravamento em razão dos antecedentes (reincidência) do/a denunciado/a, adotando-se a gradação seguinte, nos termos do artigo 24 e 27 do Código de Ética do/a Assistente Social.” O art. 5º prossegue com dois parágrafos. O arquivo possui uma quarta página com apenas o rodapé. Fonte: PDF recebido, páginas 1 e 3.</w:t>
             </w:r>
           </w:p>
         </w:tc>
@@ -5424,7 +5116,7 @@
         </w:rPr>
         <w:t xml:space="preserve">PDF oficial: </w:t>
       </w:r>
-      <w:hyperlink w:history="1" r:id="rIdh464ay3s8ssprqell9tod">
+      <w:hyperlink w:history="1" r:id="rIdjwff2vygbo_ii1bnr3udm">
         <w:r>
           <w:rPr>
             <w:rFonts w:ascii="Calibri" w:cs="Calibri" w:eastAsia="Calibri" w:hAnsi="Calibri"/>
@@ -5444,7 +5136,7 @@
         </w:rPr>
         <w:t xml:space="preserve">   ·   </w:t>
       </w:r>
-      <w:hyperlink w:history="1" r:id="rIdkstvq0gtkyuzfbv3ays6m">
+      <w:hyperlink w:history="1" r:id="rIdif0bzmont4oic7jbwljso">
         <w:r>
           <w:rPr>
             <w:rFonts w:ascii="Calibri" w:cs="Calibri" w:eastAsia="Calibri" w:hAnsi="Calibri"/>
@@ -5474,16 +5166,18 @@
       </w:r>
     </w:p>
     <w:p>
+      <w:r>
+        <w:rPr/>
+        <w:t>RESPOSTA: O PDF recebido contém 8 páginas, com a resolução, assinatura, indicação de publicação no DOU e os quatro anexos. O nome corresponde ao anexo indicado na página do CFESS; não foi realizada comparação de autenticidade entre os arquivos.</w:t>
+      </w:r>
+    </w:p>
+    <w:p>
       <w:pPr>
         <w:spacing w:after="100"/>
       </w:pPr>
       <w:r>
-        <w:rPr>
-          <w:rFonts w:ascii="Calibri" w:cs="Calibri" w:eastAsia="Calibri" w:hAnsi="Calibri"/>
-          <w:sz w:val="22"/>
-          <w:szCs w:val="22"/>
-        </w:rPr>
-        <w:t xml:space="preserve">☐  Sim     ☐  Não     ☐  Não consegui verificar</w:t>
+        <w:rPr/>
+        <w:t>☒ Sim, quanto ao conteúdo identificado     ☐ Não     ☐ Não consegui verificar</w:t>
       </w:r>
     </w:p>
     <w:p>
@@ -5753,22 +5447,7 @@
           </w:tcPr>
           <w:p>
             <w:r>
-              <w:rPr>
-                <w:rFonts w:ascii="Calibri" w:cs="Calibri" w:eastAsia="Calibri" w:hAnsi="Calibri"/>
-                <w:sz w:val="22"/>
-                <w:szCs w:val="22"/>
-              </w:rPr>
-              <w:t xml:space="preserve">☐ Sim</w:t>
-            </w:r>
-          </w:p>
-          <w:p>
-            <w:r>
-              <w:rPr>
-                <w:rFonts w:ascii="Calibri" w:cs="Calibri" w:eastAsia="Calibri" w:hAnsi="Calibri"/>
-                <w:sz w:val="22"/>
-                <w:szCs w:val="22"/>
-              </w:rPr>
-              <w:t xml:space="preserve">☐ Não</w:t>
+              <w:t>☒ Sim     ☐ Não</w:t>
             </w:r>
           </w:p>
         </w:tc>
@@ -5877,22 +5556,7 @@
           </w:tcPr>
           <w:p>
             <w:r>
-              <w:rPr>
-                <w:rFonts w:ascii="Calibri" w:cs="Calibri" w:eastAsia="Calibri" w:hAnsi="Calibri"/>
-                <w:sz w:val="22"/>
-                <w:szCs w:val="22"/>
-              </w:rPr>
-              <w:t xml:space="preserve">☐ Sim</w:t>
-            </w:r>
-          </w:p>
-          <w:p>
-            <w:r>
-              <w:rPr>
-                <w:rFonts w:ascii="Calibri" w:cs="Calibri" w:eastAsia="Calibri" w:hAnsi="Calibri"/>
-                <w:sz w:val="22"/>
-                <w:szCs w:val="22"/>
-              </w:rPr>
-              <w:t xml:space="preserve">☐ Não</w:t>
+              <w:t>☒ Sim     ☐ Não</w:t>
             </w:r>
           </w:p>
         </w:tc>
@@ -6001,22 +5665,7 @@
           </w:tcPr>
           <w:p>
             <w:r>
-              <w:rPr>
-                <w:rFonts w:ascii="Calibri" w:cs="Calibri" w:eastAsia="Calibri" w:hAnsi="Calibri"/>
-                <w:sz w:val="22"/>
-                <w:szCs w:val="22"/>
-              </w:rPr>
-              <w:t xml:space="preserve">☐ Sim</w:t>
-            </w:r>
-          </w:p>
-          <w:p>
-            <w:r>
-              <w:rPr>
-                <w:rFonts w:ascii="Calibri" w:cs="Calibri" w:eastAsia="Calibri" w:hAnsi="Calibri"/>
-                <w:sz w:val="22"/>
-                <w:szCs w:val="22"/>
-              </w:rPr>
-              <w:t xml:space="preserve">☐ Não</w:t>
+              <w:t>☒ Sim     ☐ Não</w:t>
             </w:r>
           </w:p>
         </w:tc>
@@ -6036,6 +5685,14 @@
           <w:szCs w:val="22"/>
         </w:rPr>
         <w:t xml:space="preserve">c) Qual é a situação desta norma hoje?</w:t>
+      </w:r>
+    </w:p>
+    <w:p>
+      <w:r>
+        <w:rPr>
+          <w:highlight w:val="red"/>
+        </w:rPr>
+        <w:t>RESPOSTA: Em vigor, conforme as informações e fontes encaminhadas. A Resolução CFESS nº 950/2020 acrescentou o parágrafo único ao art. 9º e instituiu os modelos de certidão dos anexos I a IV. Não foi informada revogação, suspensão ou outra alteração posterior. Fontes: https://www.cfess.org.br/legislacao/view/216/resolucao-9342020 e https://www.cfess.org.br/arquivos/res934compilada.pdf.</w:t>
       </w:r>
     </w:p>
     <w:p>
@@ -6077,12 +5734,8 @@
         <w:spacing w:after="100"/>
       </w:pPr>
       <w:r>
-        <w:rPr>
-          <w:rFonts w:ascii="Calibri" w:cs="Calibri" w:eastAsia="Calibri" w:hAnsi="Calibri"/>
-          <w:sz w:val="22"/>
-          <w:szCs w:val="22"/>
-        </w:rPr>
-        <w:t xml:space="preserve">☐  Vigente     ☐  Vigente com alterações     ☐  Revogada     ☐  Suspensa ou invalidada     ☐  Não sei</w:t>
+        <w:rPr/>
+        <w:t>☐ Vigente     ☒ Vigente com alterações     ☐ Revogada     ☐ Suspensa ou invalidada     ☐ Não sei</w:t>
       </w:r>
     </w:p>
     <w:tbl>
@@ -6120,35 +5773,8 @@
           </w:tcPr>
           <w:p>
             <w:r>
-              <w:rPr>
-                <w:rFonts w:ascii="Calibri" w:cs="Calibri" w:eastAsia="Calibri" w:hAnsi="Calibri"/>
-                <w:i/>
-                <w:iCs/>
-                <w:color w:val="4F5D70"/>
-                <w:sz w:val="22"/>
-                <w:szCs w:val="22"/>
-              </w:rPr>
-              <w:t xml:space="preserve">Se alterada, revogada ou suspensa: por qual norma e em quê (se souber):</w:t>
-            </w:r>
-          </w:p>
-          <w:p>
-            <w:r>
-              <w:rPr>
-                <w:rFonts w:ascii="Calibri" w:cs="Calibri" w:eastAsia="Calibri" w:hAnsi="Calibri"/>
-                <w:sz w:val="22"/>
-                <w:szCs w:val="22"/>
-              </w:rPr>
-              <w:t xml:space="preserve"/>
-            </w:r>
-          </w:p>
-          <w:p>
-            <w:r>
-              <w:rPr>
-                <w:rFonts w:ascii="Calibri" w:cs="Calibri" w:eastAsia="Calibri" w:hAnsi="Calibri"/>
-                <w:sz w:val="22"/>
-                <w:szCs w:val="22"/>
-              </w:rPr>
-              <w:t xml:space="preserve"/>
+              <w:rPr/>
+              <w:t>Se alterada, revogada ou suspensa: A Resolução CFESS nº 950/2020 acrescentou parágrafo único ao art. 9º, com os modelos de certidão dos anexos I a IV. Conforme as informações encaminhadas, não foi identificada revogação, suspensão ou outra alteração posterior. Fonte: https://cfess.org.br/legislacao/view/625/resolucao-n-9502020.</w:t>
             </w:r>
           </w:p>
         </w:tc>
@@ -6205,25 +5831,9 @@
           </w:tcPr>
           <w:p>
             <w:r>
-              <w:rPr>
-                <w:rFonts w:ascii="Calibri" w:cs="Calibri" w:eastAsia="Calibri" w:hAnsi="Calibri"/>
-                <w:i/>
-                <w:iCs/>
-                <w:color w:val="4F5D70"/>
-                <w:sz w:val="22"/>
-                <w:szCs w:val="22"/>
-              </w:rPr>
-              <w:t xml:space="preserve">Algo a corrigir ou registrar sobre este documento:</w:t>
-            </w:r>
-          </w:p>
-          <w:p>
-            <w:r>
-              <w:rPr>
-                <w:rFonts w:ascii="Calibri" w:cs="Calibri" w:eastAsia="Calibri" w:hAnsi="Calibri"/>
-                <w:sz w:val="22"/>
-                <w:szCs w:val="22"/>
-              </w:rPr>
-              <w:t xml:space="preserve"/>
+              <w:t>Algo a corrigir ou registrar sobre este documento:</w:t>
+              <w:br/>
+              <w:t>O PDF contém a resolução nas páginas 1 a 3 e os anexos I a IV nas páginas 4 a 8; o anexo II se estende pelas páginas 5 e 6. O parágrafo único do art. 9º identifica expressamente sua inclusão pela Resolução 950/2020. Os três trechos da tabela correspondem à redação do PDF. Fonte: res934compilada.pdf, páginas 1 a 8.</w:t>
             </w:r>
           </w:p>
         </w:tc>
@@ -6276,7 +5886,7 @@
         </w:rPr>
         <w:t xml:space="preserve">PDF oficial: </w:t>
       </w:r>
-      <w:hyperlink w:history="1" r:id="rIdp_1n9uvdk1yyp52gelqbr">
+      <w:hyperlink w:history="1" r:id="rIdgkxs-j0ttntvfad573yfq">
         <w:r>
           <w:rPr>
             <w:rFonts w:ascii="Calibri" w:cs="Calibri" w:eastAsia="Calibri" w:hAnsi="Calibri"/>
@@ -6296,7 +5906,7 @@
         </w:rPr>
         <w:t xml:space="preserve">   ·   </w:t>
       </w:r>
-      <w:hyperlink w:history="1" r:id="rIdtzzeo7pj-ybsqbcuoppr7">
+      <w:hyperlink w:history="1" r:id="rId1exbbazc1bq_vavrnp5vr">
         <w:r>
           <w:rPr>
             <w:rFonts w:ascii="Calibri" w:cs="Calibri" w:eastAsia="Calibri" w:hAnsi="Calibri"/>
@@ -6326,16 +5936,18 @@
       </w:r>
     </w:p>
     <w:p>
+      <w:r>
+        <w:rPr/>
+        <w:t>RESPOSTA: O PDF recebido contém 7 páginas, com a resolução, a assinatura, os quatro modelos de certidão e a informação de publicação no Diário Oficial. Seu nome corresponde ao anexo indicado no portal do CFESS; não foi realizada comparação de autenticidade entre arquivos.</w:t>
+      </w:r>
+    </w:p>
+    <w:p>
       <w:pPr>
         <w:spacing w:after="100"/>
       </w:pPr>
       <w:r>
-        <w:rPr>
-          <w:rFonts w:ascii="Calibri" w:cs="Calibri" w:eastAsia="Calibri" w:hAnsi="Calibri"/>
-          <w:sz w:val="22"/>
-          <w:szCs w:val="22"/>
-        </w:rPr>
-        <w:t xml:space="preserve">☐  Sim     ☐  Não     ☐  Não consegui verificar</w:t>
+        <w:rPr/>
+        <w:t>☒ Sim, quanto ao conteúdo identificado     ☐ Não     ☐ Não consegui verificar</w:t>
       </w:r>
     </w:p>
     <w:p>
@@ -6605,22 +6217,7 @@
           </w:tcPr>
           <w:p>
             <w:r>
-              <w:rPr>
-                <w:rFonts w:ascii="Calibri" w:cs="Calibri" w:eastAsia="Calibri" w:hAnsi="Calibri"/>
-                <w:sz w:val="22"/>
-                <w:szCs w:val="22"/>
-              </w:rPr>
-              <w:t xml:space="preserve">☐ Sim</w:t>
-            </w:r>
-          </w:p>
-          <w:p>
-            <w:r>
-              <w:rPr>
-                <w:rFonts w:ascii="Calibri" w:cs="Calibri" w:eastAsia="Calibri" w:hAnsi="Calibri"/>
-                <w:sz w:val="22"/>
-                <w:szCs w:val="22"/>
-              </w:rPr>
-              <w:t xml:space="preserve">☐ Não</w:t>
+              <w:t>☒ Sim     ☐ Não</w:t>
             </w:r>
           </w:p>
         </w:tc>
@@ -6729,22 +6326,7 @@
           </w:tcPr>
           <w:p>
             <w:r>
-              <w:rPr>
-                <w:rFonts w:ascii="Calibri" w:cs="Calibri" w:eastAsia="Calibri" w:hAnsi="Calibri"/>
-                <w:sz w:val="22"/>
-                <w:szCs w:val="22"/>
-              </w:rPr>
-              <w:t xml:space="preserve">☐ Sim</w:t>
-            </w:r>
-          </w:p>
-          <w:p>
-            <w:r>
-              <w:rPr>
-                <w:rFonts w:ascii="Calibri" w:cs="Calibri" w:eastAsia="Calibri" w:hAnsi="Calibri"/>
-                <w:sz w:val="22"/>
-                <w:szCs w:val="22"/>
-              </w:rPr>
-              <w:t xml:space="preserve">☐ Não</w:t>
+              <w:t>☒ Sim     ☐ Não</w:t>
             </w:r>
           </w:p>
         </w:tc>
@@ -6830,7 +6412,7 @@
                 <w:sz w:val="22"/>
                 <w:szCs w:val="22"/>
               </w:rPr>
-              <w:t xml:space="preserve">Art. 4º Esta Resolução entra em vigor na data de sua publicação, devendo ser amplamente divulgada pelos Conselhos Regionais e Federal de Serviço Social e Seccionais. MARIA ELIZABETH SANTANA BORGES Conselheira Presidente do Cfess</w:t>
+              <w:t xml:space="preserve">Art. 4º Esta Resolução entra em vigor na data de sua publicação, devendo ser amplamente divulgada pelos Conselhos Regionais e Federal de Serviço Social e Seccionais. MARIA ELIZABETH SANTANA BORGES Conselheira Presidente do Cfess ______________________________________________________________________________ SHS - Quadra 6 – Complexo Brasil 21 – Bloco E – Sala 2001 - CEP- 70322-915 – Brasília/DF. Fone: (61) 3223-1652 -…</w:t>
             </w:r>
           </w:p>
         </w:tc>
@@ -6853,22 +6435,8 @@
           </w:tcPr>
           <w:p>
             <w:r>
-              <w:rPr>
-                <w:rFonts w:ascii="Calibri" w:cs="Calibri" w:eastAsia="Calibri" w:hAnsi="Calibri"/>
-                <w:sz w:val="22"/>
-                <w:szCs w:val="22"/>
-              </w:rPr>
-              <w:t xml:space="preserve">☐ Sim</w:t>
-            </w:r>
-          </w:p>
-          <w:p>
-            <w:r>
-              <w:rPr>
-                <w:rFonts w:ascii="Calibri" w:cs="Calibri" w:eastAsia="Calibri" w:hAnsi="Calibri"/>
-                <w:sz w:val="22"/>
-                <w:szCs w:val="22"/>
-              </w:rPr>
-              <w:t xml:space="preserve">☐ Não</w:t>
+              <w:rPr/>
+              <w:t>☐ Sim     ☒ Não: o texto do art. 4º confere, mas a leitura também inclui assinatura e rodapé, que não integram o artigo.</w:t>
             </w:r>
           </w:p>
         </w:tc>
@@ -6888,6 +6456,14 @@
           <w:szCs w:val="22"/>
         </w:rPr>
         <w:t xml:space="preserve">c) Qual é a situação desta norma hoje?</w:t>
+      </w:r>
+    </w:p>
+    <w:p>
+      <w:r>
+        <w:rPr>
+          <w:highlight w:val="red"/>
+        </w:rPr>
+        <w:t>RESPOSTA: Em vigor, conforme as informações e fontes encaminhadas. A Resolução CFESS nº 950/2020 instituiu os modelos de certidão disciplinar e/ou ética e acrescentou parágrafo único ao art. 9º da Resolução nº 934/2020. Não foi informada revogação ou alteração posterior. Fonte: https://cfess.org.br/legislacao/view/625/resolucao-n-9502020.</w:t>
       </w:r>
     </w:p>
     <w:p>
@@ -6947,12 +6523,8 @@
         <w:spacing w:after="100"/>
       </w:pPr>
       <w:r>
-        <w:rPr>
-          <w:rFonts w:ascii="Calibri" w:cs="Calibri" w:eastAsia="Calibri" w:hAnsi="Calibri"/>
-          <w:sz w:val="22"/>
-          <w:szCs w:val="22"/>
-        </w:rPr>
-        <w:t xml:space="preserve">☐  Vigente     ☐  Vigente com alterações     ☐  Revogada     ☐  Suspensa ou invalidada     ☐  Não sei</w:t>
+        <w:rPr/>
+        <w:t>☒ Vigente     ☐ Vigente com alterações     ☐ Revogada     ☐ Suspensa ou invalidada     ☐ Não sei</w:t>
       </w:r>
     </w:p>
     <w:tbl>
@@ -6991,34 +6563,9 @@
           <w:p>
             <w:r>
               <w:rPr>
-                <w:rFonts w:ascii="Calibri" w:cs="Calibri" w:eastAsia="Calibri" w:hAnsi="Calibri"/>
-                <w:i/>
-                <w:iCs/>
-                <w:color w:val="4F5D70"/>
-                <w:sz w:val="22"/>
-                <w:szCs w:val="22"/>
-              </w:rPr>
-              <w:t xml:space="preserve">Se alterada, revogada ou suspensa: por qual norma e em quê (se souber):</w:t>
-            </w:r>
-          </w:p>
-          <w:p>
-            <w:r>
-              <w:rPr>
-                <w:rFonts w:ascii="Calibri" w:cs="Calibri" w:eastAsia="Calibri" w:hAnsi="Calibri"/>
-                <w:sz w:val="22"/>
-                <w:szCs w:val="22"/>
-              </w:rPr>
-              <w:t xml:space="preserve"/>
-            </w:r>
-          </w:p>
-          <w:p>
-            <w:r>
-              <w:rPr>
-                <w:rFonts w:ascii="Calibri" w:cs="Calibri" w:eastAsia="Calibri" w:hAnsi="Calibri"/>
-                <w:sz w:val="22"/>
-                <w:szCs w:val="22"/>
-              </w:rPr>
-              <w:t xml:space="preserve"/>
+                <w:highlight w:val="red"/>
+              </w:rPr>
+              <w:t>Se alterada, revogada ou suspensa: Conforme as informações encaminhadas, não foi identificada revogação ou alteração posterior da Resolução nº 950/2020. Ela acrescentou parágrafo único ao art. 9º da Resolução nº 934/2020 e instituiu os modelos constantes dos anexos I a IV. Fonte: https://www.cfess.org.br/legislacao/index?page=23.</w:t>
             </w:r>
           </w:p>
         </w:tc>
@@ -7075,25 +6622,10 @@
           </w:tcPr>
           <w:p>
             <w:r>
-              <w:rPr>
-                <w:rFonts w:ascii="Calibri" w:cs="Calibri" w:eastAsia="Calibri" w:hAnsi="Calibri"/>
-                <w:i/>
-                <w:iCs/>
-                <w:color w:val="4F5D70"/>
-                <w:sz w:val="22"/>
-                <w:szCs w:val="22"/>
-              </w:rPr>
-              <w:t xml:space="preserve">Algo a corrigir ou registrar sobre este documento:</w:t>
-            </w:r>
-          </w:p>
-          <w:p>
-            <w:r>
-              <w:rPr>
-                <w:rFonts w:ascii="Calibri" w:cs="Calibri" w:eastAsia="Calibri" w:hAnsi="Calibri"/>
-                <w:sz w:val="22"/>
-                <w:szCs w:val="22"/>
-              </w:rPr>
-              <w:t xml:space="preserve"/>
+              <w:rPr/>
+              <w:t>Algo a corrigir ou registrar sobre este documento:</w:t>
+              <w:br/>
+              <w:t>Na extração do art. 4º, separar do texto normativo a assinatura de Maria Elizabeth Santana Borges e o rodapé com endereço e contato do CFESS. Os anexos I a IV estão nas páginas 2 a 6; a página 7 informa a publicação no DOU nº 136, de 17/07/2020, seção 1, página 87. O PDF apresenta a Resolução 934 como sendo de 23 de janeiro em um considerando e de 28 de janeiro nos artigos 1º e 2º; registrar essa divergência literal sem corrigir automaticamente o texto. Fonte: PDF da Resolução 950/2020 recebido, páginas 1 a 7.</w:t>
             </w:r>
           </w:p>
         </w:tc>
@@ -7146,7 +6678,7 @@
         </w:rPr>
         <w:t xml:space="preserve">PDF oficial: </w:t>
       </w:r>
-      <w:hyperlink w:history="1" r:id="rId13hatyjiqiawhdhreicfb">
+      <w:hyperlink w:history="1" r:id="rIdjkbnkborznzmdvxcacxzr">
         <w:r>
           <w:rPr>
             <w:rFonts w:ascii="Calibri" w:cs="Calibri" w:eastAsia="Calibri" w:hAnsi="Calibri"/>
@@ -7166,7 +6698,7 @@
         </w:rPr>
         <w:t xml:space="preserve">   ·   </w:t>
       </w:r>
-      <w:hyperlink w:history="1" r:id="rId3avws6vsj8rsxydbn6rbp">
+      <w:hyperlink w:history="1" r:id="rId2lxypjlmfaidmubqn0m2m">
         <w:r>
           <w:rPr>
             <w:rFonts w:ascii="Calibri" w:cs="Calibri" w:eastAsia="Calibri" w:hAnsi="Calibri"/>
@@ -7193,6 +6725,16 @@
           <w:szCs w:val="22"/>
         </w:rPr>
         <w:t xml:space="preserve">a) O PDF é o documento oficial e está completo?</w:t>
+      </w:r>
+    </w:p>
+    <w:p>
+      <w:r>
+        <w:rPr>
+          <w:b/>
+          <w:color w:val="174F70"/>
+          <w:sz w:val="20"/>
+        </w:rPr>
+        <w:t>RESPOSTA: Sim. Exemplar oficial localizado em endereço alternativo do CFESS, com 3 páginas; o link indicado não abriu. https://www.cfess.org.br/uploads/legislacao/4580/-ruykKDrN2SWG6Pf5Ym45NGLHTvjZBo_.pdf</w:t>
       </w:r>
     </w:p>
     <w:p>
@@ -7475,22 +7017,7 @@
           </w:tcPr>
           <w:p>
             <w:r>
-              <w:rPr>
-                <w:rFonts w:ascii="Calibri" w:cs="Calibri" w:eastAsia="Calibri" w:hAnsi="Calibri"/>
-                <w:sz w:val="22"/>
-                <w:szCs w:val="22"/>
-              </w:rPr>
-              <w:t xml:space="preserve">☐ Sim</w:t>
-            </w:r>
-          </w:p>
-          <w:p>
-            <w:r>
-              <w:rPr>
-                <w:rFonts w:ascii="Calibri" w:cs="Calibri" w:eastAsia="Calibri" w:hAnsi="Calibri"/>
-                <w:sz w:val="22"/>
-                <w:szCs w:val="22"/>
-              </w:rPr>
-              <w:t xml:space="preserve">☐ Não</w:t>
+              <w:t>Sim.</w:t>
             </w:r>
           </w:p>
         </w:tc>
@@ -7599,22 +7126,7 @@
           </w:tcPr>
           <w:p>
             <w:r>
-              <w:rPr>
-                <w:rFonts w:ascii="Calibri" w:cs="Calibri" w:eastAsia="Calibri" w:hAnsi="Calibri"/>
-                <w:sz w:val="22"/>
-                <w:szCs w:val="22"/>
-              </w:rPr>
-              <w:t xml:space="preserve">☐ Sim</w:t>
-            </w:r>
-          </w:p>
-          <w:p>
-            <w:r>
-              <w:rPr>
-                <w:rFonts w:ascii="Calibri" w:cs="Calibri" w:eastAsia="Calibri" w:hAnsi="Calibri"/>
-                <w:sz w:val="22"/>
-                <w:szCs w:val="22"/>
-              </w:rPr>
-              <w:t xml:space="preserve">☐ Não</w:t>
+              <w:t>Sim. A referência à Resolução 428/2002 é a que aparece no texto de 2010; a Resolução 660/2013 informa que revogou integralmente a 428/2002.</w:t>
             </w:r>
           </w:p>
         </w:tc>
@@ -7723,22 +7235,7 @@
           </w:tcPr>
           <w:p>
             <w:r>
-              <w:rPr>
-                <w:rFonts w:ascii="Calibri" w:cs="Calibri" w:eastAsia="Calibri" w:hAnsi="Calibri"/>
-                <w:sz w:val="22"/>
-                <w:szCs w:val="22"/>
-              </w:rPr>
-              <w:t xml:space="preserve">☐ Sim</w:t>
-            </w:r>
-          </w:p>
-          <w:p>
-            <w:r>
-              <w:rPr>
-                <w:rFonts w:ascii="Calibri" w:cs="Calibri" w:eastAsia="Calibri" w:hAnsi="Calibri"/>
-                <w:sz w:val="22"/>
-                <w:szCs w:val="22"/>
-              </w:rPr>
-              <w:t xml:space="preserve">☐ Não</w:t>
+              <w:t>Sim.</w:t>
             </w:r>
           </w:p>
         </w:tc>
@@ -7761,6 +7258,16 @@
       </w:r>
     </w:p>
     <w:p>
+      <w:r>
+        <w:rPr>
+          <w:b/>
+          <w:color w:val="174F70"/>
+          <w:sz w:val="20"/>
+        </w:rPr>
+        <w:t>RESPOSTA: Vigente, conforme as informações encaminhadas. Trata-se de resolução do CFESS que veda a realização de terapias associadas ao título e/ou ao exercício profissional de assistente social. Não foi informada revogação, alteração ou suspensão. Fonte: https://www.cfess.org.br/legislacao/view/474/resolucao-n-5692010.</w:t>
+      </w:r>
+    </w:p>
+    <w:p>
       <w:pPr>
         <w:spacing w:after="100"/>
       </w:pPr>
@@ -7770,7 +7277,7 @@
           <w:sz w:val="22"/>
           <w:szCs w:val="22"/>
         </w:rPr>
-        <w:t xml:space="preserve">☐  Vigente     ☐  Vigente com alterações     ☐  Revogada     ☐  Suspensa ou invalidada     ☐  Não sei</w:t>
+        <w:t>☒ Vigente     ☐ Vigente com alterações     ☐ Revogada     ☐ Suspensa ou invalidada     ☐ Não sei</w:t>
       </w:r>
     </w:p>
     <w:tbl>
@@ -7816,27 +7323,30 @@
                 <w:sz w:val="22"/>
                 <w:szCs w:val="22"/>
               </w:rPr>
-              <w:t xml:space="preserve">Se alterada, revogada ou suspensa: por qual norma e em quê (se souber):</w:t>
-            </w:r>
-          </w:p>
-          <w:p>
-            <w:r>
-              <w:rPr>
-                <w:rFonts w:ascii="Calibri" w:cs="Calibri" w:eastAsia="Calibri" w:hAnsi="Calibri"/>
-                <w:sz w:val="22"/>
-                <w:szCs w:val="22"/>
-              </w:rPr>
-              <w:t xml:space="preserve"/>
-            </w:r>
-          </w:p>
-          <w:p>
-            <w:r>
-              <w:rPr>
-                <w:rFonts w:ascii="Calibri" w:cs="Calibri" w:eastAsia="Calibri" w:hAnsi="Calibri"/>
-                <w:sz w:val="22"/>
-                <w:szCs w:val="22"/>
-              </w:rPr>
-              <w:t xml:space="preserve"/>
+              <w:t>Se alterada, revogada ou suspensa: Conforme as informações encaminhadas, não foi identificada revogação, alteração ou suspensão. A norma original remete à Resolução CFESS nº 428/2002, posteriormente revogada pela Resolução nº 660/2013; essa substituição da norma processual não equivale, por si só, à revogação da Resolução nº 569/2010.</w:t>
+            </w:r>
+          </w:p>
+          <w:p>
+            <w:r>
+              <w:rPr>
+                <w:rFonts w:ascii="Calibri" w:cs="Calibri" w:eastAsia="Calibri" w:hAnsi="Calibri"/>
+                <w:sz w:val="22"/>
+                <w:szCs w:val="22"/>
+              </w:rPr>
+            </w:r>
+          </w:p>
+          <w:p>
+            <w:r>
+              <w:rPr>
+                <w:rFonts w:ascii="Calibri" w:cs="Calibri" w:eastAsia="Calibri" w:hAnsi="Calibri"/>
+                <w:sz w:val="22"/>
+                <w:szCs w:val="22"/>
+              </w:rPr>
+            </w:r>
+          </w:p>
+          <w:p>
+            <w:r>
+              <w:rPr/>
             </w:r>
           </w:p>
         </w:tc>
@@ -7914,6 +7424,11 @@
               <w:t xml:space="preserve"/>
             </w:r>
           </w:p>
+          <w:p>
+            <w:r>
+              <w:t>RESPOSTA: Fonte alternativa oficial de três páginas: https://www.cfess.org.br/uploads/legislacao/4580/-ruykKDrN2SWG6Pf5Ym45NGLHTvjZBo_.pdf</w:t>
+            </w:r>
+          </w:p>
         </w:tc>
       </w:tr>
     </w:tbl>
@@ -7964,7 +7479,7 @@
         </w:rPr>
         <w:t xml:space="preserve">PDF oficial: </w:t>
       </w:r>
-      <w:hyperlink w:history="1" r:id="rIdwisbj9sh7ye6hlu37eez9">
+      <w:hyperlink w:history="1" r:id="rIdq36sd4zywbfc-wgnecz7a">
         <w:r>
           <w:rPr>
             <w:rFonts w:ascii="Calibri" w:cs="Calibri" w:eastAsia="Calibri" w:hAnsi="Calibri"/>
@@ -7984,7 +7499,7 @@
         </w:rPr>
         <w:t xml:space="preserve">   ·   </w:t>
       </w:r>
-      <w:hyperlink w:history="1" r:id="rIdo0g4iin2xqb7cttng1bgc">
+      <w:hyperlink w:history="1" r:id="rIdty23l7zpljwghzilx94ye">
         <w:r>
           <w:rPr>
             <w:rFonts w:ascii="Calibri" w:cs="Calibri" w:eastAsia="Calibri" w:hAnsi="Calibri"/>
@@ -8011,6 +7526,16 @@
           <w:szCs w:val="22"/>
         </w:rPr>
         <w:t xml:space="preserve">a) O PDF é o documento oficial e está completo?</w:t>
+      </w:r>
+    </w:p>
+    <w:p>
+      <w:r>
+        <w:rPr>
+          <w:b/>
+          <w:color w:val="174F70"/>
+          <w:sz w:val="20"/>
+        </w:rPr>
+        <w:t>RESPOSTA: Sim. PDF oficial de 3 páginas, com resolução até a assinatura.</w:t>
       </w:r>
     </w:p>
     <w:p>
@@ -8293,22 +7818,7 @@
           </w:tcPr>
           <w:p>
             <w:r>
-              <w:rPr>
-                <w:rFonts w:ascii="Calibri" w:cs="Calibri" w:eastAsia="Calibri" w:hAnsi="Calibri"/>
-                <w:sz w:val="22"/>
-                <w:szCs w:val="22"/>
-              </w:rPr>
-              <w:t xml:space="preserve">☐ Sim</w:t>
-            </w:r>
-          </w:p>
-          <w:p>
-            <w:r>
-              <w:rPr>
-                <w:rFonts w:ascii="Calibri" w:cs="Calibri" w:eastAsia="Calibri" w:hAnsi="Calibri"/>
-                <w:sz w:val="22"/>
-                <w:szCs w:val="22"/>
-              </w:rPr>
-              <w:t xml:space="preserve">☐ Não</w:t>
+              <w:t>Sim.</w:t>
             </w:r>
           </w:p>
         </w:tc>
@@ -8417,22 +7927,7 @@
           </w:tcPr>
           <w:p>
             <w:r>
-              <w:rPr>
-                <w:rFonts w:ascii="Calibri" w:cs="Calibri" w:eastAsia="Calibri" w:hAnsi="Calibri"/>
-                <w:sz w:val="22"/>
-                <w:szCs w:val="22"/>
-              </w:rPr>
-              <w:t xml:space="preserve">☐ Sim</w:t>
-            </w:r>
-          </w:p>
-          <w:p>
-            <w:r>
-              <w:rPr>
-                <w:rFonts w:ascii="Calibri" w:cs="Calibri" w:eastAsia="Calibri" w:hAnsi="Calibri"/>
-                <w:sz w:val="22"/>
-                <w:szCs w:val="22"/>
-              </w:rPr>
-              <w:t xml:space="preserve">☐ Não</w:t>
+              <w:t>Sim.</w:t>
             </w:r>
           </w:p>
         </w:tc>
@@ -8541,22 +8036,8 @@
           </w:tcPr>
           <w:p>
             <w:r>
-              <w:rPr>
-                <w:rFonts w:ascii="Calibri" w:cs="Calibri" w:eastAsia="Calibri" w:hAnsi="Calibri"/>
-                <w:sz w:val="22"/>
-                <w:szCs w:val="22"/>
-              </w:rPr>
-              <w:t xml:space="preserve">☐ Sim</w:t>
-            </w:r>
-          </w:p>
-          <w:p>
-            <w:r>
-              <w:rPr>
-                <w:rFonts w:ascii="Calibri" w:cs="Calibri" w:eastAsia="Calibri" w:hAnsi="Calibri"/>
-                <w:sz w:val="22"/>
-                <w:szCs w:val="22"/>
-              </w:rPr>
-              <w:t xml:space="preserve">☐ Não</w:t>
+              <w:rPr/>
+              <w:t>Não: texto exibido termina em reticências. O artigo continua até “competentes, garantindo-se o direito a defesa e ao contraditório.”</w:t>
             </w:r>
           </w:p>
         </w:tc>
@@ -8579,6 +8060,17 @@
       </w:r>
     </w:p>
     <w:p>
+      <w:r>
+        <w:rPr>
+          <w:b/>
+          <w:color w:val="174F70"/>
+          <w:sz w:val="20"/>
+          <w:highlight w:val="red"/>
+        </w:rPr>
+        <w:t>RESPOSTA: Vigente, conforme as informações encaminhadas. A Resolução CFESS nº 489/2006 veda condutas discriminatórias ou preconceituosas relacionadas à orientação e expressão sexual no exercício profissional. Fonte: https://www.cfess.org.br/legislacao/view/516/resolucao-n-4892006.</w:t>
+      </w:r>
+    </w:p>
+    <w:p>
       <w:pPr>
         <w:spacing w:after="100"/>
       </w:pPr>
@@ -8588,7 +8080,7 @@
           <w:sz w:val="22"/>
           <w:szCs w:val="22"/>
         </w:rPr>
-        <w:t xml:space="preserve">☐  Vigente     ☐  Vigente com alterações     ☐  Revogada     ☐  Suspensa ou invalidada     ☐  Não sei</w:t>
+        <w:t>☒ Vigente     ☐ Vigente com alterações     ☐ Revogada     ☐ Suspensa ou invalidada     ☐ Não sei</w:t>
       </w:r>
     </w:p>
     <w:tbl>
@@ -8634,27 +8126,32 @@
                 <w:sz w:val="22"/>
                 <w:szCs w:val="22"/>
               </w:rPr>
-              <w:t xml:space="preserve">Se alterada, revogada ou suspensa: por qual norma e em quê (se souber):</w:t>
-            </w:r>
-          </w:p>
-          <w:p>
-            <w:r>
-              <w:rPr>
-                <w:rFonts w:ascii="Calibri" w:cs="Calibri" w:eastAsia="Calibri" w:hAnsi="Calibri"/>
-                <w:sz w:val="22"/>
-                <w:szCs w:val="22"/>
-              </w:rPr>
-              <w:t xml:space="preserve"/>
-            </w:r>
-          </w:p>
-          <w:p>
-            <w:r>
-              <w:rPr>
-                <w:rFonts w:ascii="Calibri" w:cs="Calibri" w:eastAsia="Calibri" w:hAnsi="Calibri"/>
-                <w:sz w:val="22"/>
-                <w:szCs w:val="22"/>
-              </w:rPr>
-              <w:t xml:space="preserve"/>
+              <w:t>Se alterada, revogada ou suspensa: Conforme as informações encaminhadas, não foi identificada revogação. A Resolução CFESS nº 845/2018 trata da atuação profissional no processo transexualizador e relaciona-se ao tema, sem constituir alteração expressa da Resolução nº 489/2006. Fontes: https://www.cfess.org.br/legislacao/view/516/resolucao-n-4892006 e https://www.cfess.org.br/legislacao/view/383/resolucao-n-8452018.</w:t>
+            </w:r>
+          </w:p>
+          <w:p>
+            <w:r>
+              <w:rPr>
+                <w:rFonts w:ascii="Calibri" w:cs="Calibri" w:eastAsia="Calibri" w:hAnsi="Calibri"/>
+                <w:sz w:val="22"/>
+                <w:szCs w:val="22"/>
+              </w:rPr>
+            </w:r>
+          </w:p>
+          <w:p>
+            <w:r>
+              <w:rPr>
+                <w:rFonts w:ascii="Calibri" w:cs="Calibri" w:eastAsia="Calibri" w:hAnsi="Calibri"/>
+                <w:sz w:val="22"/>
+                <w:szCs w:val="22"/>
+              </w:rPr>
+            </w:r>
+          </w:p>
+          <w:p>
+            <w:r>
+              <w:rPr>
+                <w:highlight w:val="red"/>
+              </w:rPr>
             </w:r>
           </w:p>
         </w:tc>
@@ -8732,6 +8229,17 @@
               <w:t xml:space="preserve"/>
             </w:r>
           </w:p>
+          <w:p>
+            <w:r>
+              <w:rPr/>
+              <w:t>RESPOSTA: O art. 7º exibido no formulário está truncado. Fonte: https://www.cfess.org.br/uploads/legislacao/4625/resolucao_489_06.pdf</w:t>
+            </w:r>
+          </w:p>
+          <w:p>
+            <w:r>
+              <w:t>Contexto complementar: em 2019, o STF determinou o enquadramento da homofobia e da transfobia na Lei nº 7.716/1989 até a edição de lei específica. Essa decisão não altera, por si, o texto da Resolução nº 489/2006.</w:t>
+            </w:r>
+          </w:p>
         </w:tc>
       </w:tr>
     </w:tbl>
@@ -8782,7 +8290,7 @@
         </w:rPr>
         <w:t xml:space="preserve">PDF oficial: </w:t>
       </w:r>
-      <w:hyperlink w:history="1" r:id="rIdlpqlzmy1r_gi0b16shutt">
+      <w:hyperlink w:history="1" r:id="rIdql1e82q-zod4qnworz5ya">
         <w:r>
           <w:rPr>
             <w:rFonts w:ascii="Calibri" w:cs="Calibri" w:eastAsia="Calibri" w:hAnsi="Calibri"/>
@@ -8802,7 +8310,7 @@
         </w:rPr>
         <w:t xml:space="preserve">   ·   </w:t>
       </w:r>
-      <w:hyperlink w:history="1" r:id="rIdtf8xoj7gxfw4ut9e_urzt">
+      <w:hyperlink w:history="1" r:id="rIdgv6whnmr_5luiax9xk29c">
         <w:r>
           <w:rPr>
             <w:rFonts w:ascii="Calibri" w:cs="Calibri" w:eastAsia="Calibri" w:hAnsi="Calibri"/>
@@ -8832,16 +8340,17 @@
       </w:r>
     </w:p>
     <w:p>
+      <w:r>
+        <w:t>RESPOSTA: O PDF recebido contém três páginas, desde a identificação até a assinatura e a informação de publicação no DOU. Seu nome corresponde ao PDF indicado na atividade; não foi feita comparação de autenticidade entre os arquivos.</w:t>
+      </w:r>
+    </w:p>
+    <w:p>
       <w:pPr>
         <w:spacing w:after="100"/>
       </w:pPr>
       <w:r>
-        <w:rPr>
-          <w:rFonts w:ascii="Calibri" w:cs="Calibri" w:eastAsia="Calibri" w:hAnsi="Calibri"/>
-          <w:sz w:val="22"/>
-          <w:szCs w:val="22"/>
-        </w:rPr>
-        <w:t xml:space="preserve">☐  Sim     ☐  Não     ☐  Não consegui verificar</w:t>
+        <w:rPr/>
+        <w:t>☒ Sim, quanto ao conteúdo identificado     ☐ Não     ☐ Não consegui verificar</w:t>
       </w:r>
     </w:p>
     <w:p>
@@ -9111,22 +8620,7 @@
           </w:tcPr>
           <w:p>
             <w:r>
-              <w:rPr>
-                <w:rFonts w:ascii="Calibri" w:cs="Calibri" w:eastAsia="Calibri" w:hAnsi="Calibri"/>
-                <w:sz w:val="22"/>
-                <w:szCs w:val="22"/>
-              </w:rPr>
-              <w:t xml:space="preserve">☐ Sim</w:t>
-            </w:r>
-          </w:p>
-          <w:p>
-            <w:r>
-              <w:rPr>
-                <w:rFonts w:ascii="Calibri" w:cs="Calibri" w:eastAsia="Calibri" w:hAnsi="Calibri"/>
-                <w:sz w:val="22"/>
-                <w:szCs w:val="22"/>
-              </w:rPr>
-              <w:t xml:space="preserve">☐ Não</w:t>
+              <w:t>☒ Sim     ☐ Não</w:t>
             </w:r>
           </w:p>
         </w:tc>
@@ -9235,22 +8729,7 @@
           </w:tcPr>
           <w:p>
             <w:r>
-              <w:rPr>
-                <w:rFonts w:ascii="Calibri" w:cs="Calibri" w:eastAsia="Calibri" w:hAnsi="Calibri"/>
-                <w:sz w:val="22"/>
-                <w:szCs w:val="22"/>
-              </w:rPr>
-              <w:t xml:space="preserve">☐ Sim</w:t>
-            </w:r>
-          </w:p>
-          <w:p>
-            <w:r>
-              <w:rPr>
-                <w:rFonts w:ascii="Calibri" w:cs="Calibri" w:eastAsia="Calibri" w:hAnsi="Calibri"/>
-                <w:sz w:val="22"/>
-                <w:szCs w:val="22"/>
-              </w:rPr>
-              <w:t xml:space="preserve">☐ Não</w:t>
+              <w:t>☒ Sim     ☐ Não</w:t>
             </w:r>
           </w:p>
         </w:tc>
@@ -9359,22 +8838,7 @@
           </w:tcPr>
           <w:p>
             <w:r>
-              <w:rPr>
-                <w:rFonts w:ascii="Calibri" w:cs="Calibri" w:eastAsia="Calibri" w:hAnsi="Calibri"/>
-                <w:sz w:val="22"/>
-                <w:szCs w:val="22"/>
-              </w:rPr>
-              <w:t xml:space="preserve">☐ Sim</w:t>
-            </w:r>
-          </w:p>
-          <w:p>
-            <w:r>
-              <w:rPr>
-                <w:rFonts w:ascii="Calibri" w:cs="Calibri" w:eastAsia="Calibri" w:hAnsi="Calibri"/>
-                <w:sz w:val="22"/>
-                <w:szCs w:val="22"/>
-              </w:rPr>
-              <w:t xml:space="preserve">☐ Não</w:t>
+              <w:t>☐ Sim     ☒ Não, como exibido: a leitura está abreviada em “meios compe…”. A parte visível corresponde ao PDF.</w:t>
             </w:r>
           </w:p>
         </w:tc>
@@ -9394,6 +8858,14 @@
           <w:szCs w:val="22"/>
         </w:rPr>
         <w:t xml:space="preserve">c) Qual é a situação desta norma hoje?</w:t>
+      </w:r>
+    </w:p>
+    <w:p>
+      <w:r>
+        <w:rPr>
+          <w:highlight w:val="red"/>
+        </w:rPr>
+        <w:t>RESPOSTA: Vigente, conforme as informações encaminhadas. A Resolução CFESS nº 992/2022 veda atos e condutas discriminatórias ou preconceituosas contra pessoas com deficiência no exercício profissional. Fonte: https://www.cfess.org.br/arquivos/rescfess992.pdf.</w:t>
       </w:r>
     </w:p>
     <w:p>
@@ -9435,12 +8907,8 @@
         <w:spacing w:after="100"/>
       </w:pPr>
       <w:r>
-        <w:rPr>
-          <w:rFonts w:ascii="Calibri" w:cs="Calibri" w:eastAsia="Calibri" w:hAnsi="Calibri"/>
-          <w:sz w:val="22"/>
-          <w:szCs w:val="22"/>
-        </w:rPr>
-        <w:t xml:space="preserve">☐  Vigente     ☐  Vigente com alterações     ☐  Revogada     ☐  Suspensa ou invalidada     ☐  Não sei</w:t>
+        <w:rPr/>
+        <w:t>☒ Vigente     ☐ Vigente com alterações     ☐ Revogada     ☐ Suspensa ou invalidada     ☐ Não sei</w:t>
       </w:r>
     </w:p>
     <w:tbl>
@@ -9479,34 +8947,9 @@
           <w:p>
             <w:r>
               <w:rPr>
-                <w:rFonts w:ascii="Calibri" w:cs="Calibri" w:eastAsia="Calibri" w:hAnsi="Calibri"/>
-                <w:i/>
-                <w:iCs/>
-                <w:color w:val="4F5D70"/>
-                <w:sz w:val="22"/>
-                <w:szCs w:val="22"/>
-              </w:rPr>
-              <w:t xml:space="preserve">Se alterada, revogada ou suspensa: por qual norma e em quê (se souber):</w:t>
-            </w:r>
-          </w:p>
-          <w:p>
-            <w:r>
-              <w:rPr>
-                <w:rFonts w:ascii="Calibri" w:cs="Calibri" w:eastAsia="Calibri" w:hAnsi="Calibri"/>
-                <w:sz w:val="22"/>
-                <w:szCs w:val="22"/>
-              </w:rPr>
-              <w:t xml:space="preserve"/>
-            </w:r>
-          </w:p>
-          <w:p>
-            <w:r>
-              <w:rPr>
-                <w:rFonts w:ascii="Calibri" w:cs="Calibri" w:eastAsia="Calibri" w:hAnsi="Calibri"/>
-                <w:sz w:val="22"/>
-                <w:szCs w:val="22"/>
-              </w:rPr>
-              <w:t xml:space="preserve"/>
+                <w:highlight w:val="red"/>
+              </w:rPr>
+              <w:t>Se alterada, revogada ou suspensa: Conforme as informações encaminhadas, não foi identificada alteração, revogação ou suspensão posterior. O PDF da norma, isoladamente, não comprova a inexistência de atos posteriores. Fonte: https://www.cfess.org.br/arquivos/rescfess992.pdf.</w:t>
             </w:r>
           </w:p>
         </w:tc>
@@ -9563,25 +9006,10 @@
           </w:tcPr>
           <w:p>
             <w:r>
-              <w:rPr>
-                <w:rFonts w:ascii="Calibri" w:cs="Calibri" w:eastAsia="Calibri" w:hAnsi="Calibri"/>
-                <w:i/>
-                <w:iCs/>
-                <w:color w:val="4F5D70"/>
-                <w:sz w:val="22"/>
-                <w:szCs w:val="22"/>
-              </w:rPr>
-              <w:t xml:space="preserve">Algo a corrigir ou registrar sobre este documento:</w:t>
-            </w:r>
-          </w:p>
-          <w:p>
-            <w:r>
-              <w:rPr>
-                <w:rFonts w:ascii="Calibri" w:cs="Calibri" w:eastAsia="Calibri" w:hAnsi="Calibri"/>
-                <w:sz w:val="22"/>
-                <w:szCs w:val="22"/>
-              </w:rPr>
-              <w:t xml:space="preserve"/>
+              <w:rPr/>
+              <w:t>Algo a corrigir ou registrar sobre este documento:</w:t>
+              <w:br/>
+              <w:t>O art. 7º exibido na atividade está truncado; após “meios” o PDF prossegue: “competentes, garantindo-se o direito a defesa e ao contraditório.” A presença de reticências na atividade não permite afirmar se o sistema armazenou o texto integral. A própria ementa informa que a resolução regulamenta os princípios II, VI e XI do Código de Ética. Fonte: rescfess992.pdf, páginas 1 a 3.</w:t>
             </w:r>
           </w:p>
         </w:tc>
@@ -9634,7 +9062,7 @@
         </w:rPr>
         <w:t xml:space="preserve">PDF oficial: </w:t>
       </w:r>
-      <w:hyperlink w:history="1" r:id="rIdxr9la9u7v8dqa8nz-fpbt">
+      <w:hyperlink w:history="1" r:id="rIdrbwws7brd6mhqpy_ynqcg">
         <w:r>
           <w:rPr>
             <w:rFonts w:ascii="Calibri" w:cs="Calibri" w:eastAsia="Calibri" w:hAnsi="Calibri"/>
@@ -9654,7 +9082,7 @@
         </w:rPr>
         <w:t xml:space="preserve">   ·   </w:t>
       </w:r>
-      <w:hyperlink w:history="1" r:id="rIdcjm-luwskuv6tx34zoq6t">
+      <w:hyperlink w:history="1" r:id="rIdseep-hym9t-zcrijeubed">
         <w:r>
           <w:rPr>
             <w:rFonts w:ascii="Calibri" w:cs="Calibri" w:eastAsia="Calibri" w:hAnsi="Calibri"/>
@@ -9681,6 +9109,16 @@
           <w:szCs w:val="22"/>
         </w:rPr>
         <w:t xml:space="preserve">a) O PDF é o documento oficial e está completo?</w:t>
+      </w:r>
+    </w:p>
+    <w:p>
+      <w:r>
+        <w:rPr>
+          <w:b/>
+          <w:color w:val="174F70"/>
+          <w:sz w:val="20"/>
+        </w:rPr>
+        <w:t>RESPOSTA: Sim. PDF oficial de 5 páginas, da identificação à assinatura e publicação.</w:t>
       </w:r>
     </w:p>
     <w:p>
@@ -9940,7 +9378,7 @@
                 <w:sz w:val="22"/>
                 <w:szCs w:val="22"/>
               </w:rPr>
-              <w:t xml:space="preserve">Art. 1º. É vedado ao/a assistente social no exercício de sua atividade profissional, incluindo cargos de gestão e cargos genéricos, praticar ou ser conivente com condutas discriminatórias e/ou preconceituosas em relação à raça, cor, etnia, na relação com os/as usuários/as, com outros/as assistentes sociais, com outros/as profissionais, estagiários/as e trabalhadores/as.</w:t>
+              <w:t xml:space="preserve">Art. 1º. É vedado ao/a assistente social no exercício de sua atividade profissional, incluindo cargos de gestão e cargos genéricos, praticar ou ser conivente com condutas Autentique pelo link https://cfess-br.implanta.net.br/servicosonline/Publico/ValidarDocumentos/, fornecendo o código a seguir: cb084f0a-1981-45ec-afc8-55f610a4d442. ______________________________________________________________________________ SHS -…</w:t>
             </w:r>
           </w:p>
         </w:tc>
@@ -9963,22 +9401,8 @@
           </w:tcPr>
           <w:p>
             <w:r>
-              <w:rPr>
-                <w:rFonts w:ascii="Calibri" w:cs="Calibri" w:eastAsia="Calibri" w:hAnsi="Calibri"/>
-                <w:sz w:val="22"/>
-                <w:szCs w:val="22"/>
-              </w:rPr>
-              <w:t xml:space="preserve">☐ Sim</w:t>
-            </w:r>
-          </w:p>
-          <w:p>
-            <w:r>
-              <w:rPr>
-                <w:rFonts w:ascii="Calibri" w:cs="Calibri" w:eastAsia="Calibri" w:hAnsi="Calibri"/>
-                <w:sz w:val="22"/>
-                <w:szCs w:val="22"/>
-              </w:rPr>
-              <w:t xml:space="preserve">☐ Não</w:t>
+              <w:rPr/>
+              <w:t>Não: houve inserção de autenticação e rodapé entre as páginas; o artigo continua na página 4.</w:t>
             </w:r>
           </w:p>
         </w:tc>
@@ -10087,22 +9511,7 @@
           </w:tcPr>
           <w:p>
             <w:r>
-              <w:rPr>
-                <w:rFonts w:ascii="Calibri" w:cs="Calibri" w:eastAsia="Calibri" w:hAnsi="Calibri"/>
-                <w:sz w:val="22"/>
-                <w:szCs w:val="22"/>
-              </w:rPr>
-              <w:t xml:space="preserve">☐ Sim</w:t>
-            </w:r>
-          </w:p>
-          <w:p>
-            <w:r>
-              <w:rPr>
-                <w:rFonts w:ascii="Calibri" w:cs="Calibri" w:eastAsia="Calibri" w:hAnsi="Calibri"/>
-                <w:sz w:val="22"/>
-                <w:szCs w:val="22"/>
-              </w:rPr>
-              <w:t xml:space="preserve">☐ Não</w:t>
+              <w:t>Sim, conforme texto do PDF.</w:t>
             </w:r>
           </w:p>
         </w:tc>
@@ -10188,7 +9597,7 @@
                 <w:sz w:val="22"/>
                 <w:szCs w:val="22"/>
               </w:rPr>
-              <w:t xml:space="preserve">Art. 7º. Os Conselhos Federal e Regionais de Serviço Social, ao tomarem conhecimento de fatos ou de denúncias contra pessoas jurídicas ou contra indivíduos que não sejam assistentes sociais, relativas a atos e práticas de discriminação e/ou preconceito contra raça, cor e etnia, poderão, após análise e a seu critério, encaminhar às autoridades competentes para apuração e/ou oferecer representação, quando cabível, ao M…</w:t>
+              <w:t xml:space="preserve">Art. 7º. Os Conselhos Federal e Regionais de Serviço Social, ao tomarem conhecimento de fatos ou de denúncias contra pessoas jurídicas ou contra indivíduos que não sejam assistentes sociais, Autentique pelo link https://cfess-br.implanta.net.br/servicosonline/Publico/ValidarDocumentos/, fornecendo o código a seguir: cb084f0a-1981-45ec-afc8-55f610a4d442. ________________________________________________________________…</w:t>
             </w:r>
           </w:p>
         </w:tc>
@@ -10211,22 +9620,8 @@
           </w:tcPr>
           <w:p>
             <w:r>
-              <w:rPr>
-                <w:rFonts w:ascii="Calibri" w:cs="Calibri" w:eastAsia="Calibri" w:hAnsi="Calibri"/>
-                <w:sz w:val="22"/>
-                <w:szCs w:val="22"/>
-              </w:rPr>
-              <w:t xml:space="preserve">☐ Sim</w:t>
-            </w:r>
-          </w:p>
-          <w:p>
-            <w:r>
-              <w:rPr>
-                <w:rFonts w:ascii="Calibri" w:cs="Calibri" w:eastAsia="Calibri" w:hAnsi="Calibri"/>
-                <w:sz w:val="22"/>
-                <w:szCs w:val="22"/>
-              </w:rPr>
-              <w:t xml:space="preserve">☐ Não</w:t>
+              <w:rPr/>
+              <w:t>Não: há inserção de autenticação e o texto está truncado.</w:t>
             </w:r>
           </w:p>
         </w:tc>
@@ -10246,6 +9641,17 @@
           <w:szCs w:val="22"/>
         </w:rPr>
         <w:t xml:space="preserve">c) Qual é a situação desta norma hoje?</w:t>
+      </w:r>
+    </w:p>
+    <w:p>
+      <w:r>
+        <w:rPr>
+          <w:b/>
+          <w:color w:val="174F70"/>
+          <w:sz w:val="20"/>
+          <w:highlight w:val="red"/>
+        </w:rPr>
+        <w:t>RESPOSTA: Vigente, conforme as informações encaminhadas. A Resolução CFESS nº 1.054/2023 veda condutas discriminatórias e/ou preconceituosas de caráter étnico-racial no exercício profissional, incluindo cargos de gestão e cargos genéricos. Fonte: https://www.cfess.org.br/legislacao/view/257/resolucao-10542023.</w:t>
       </w:r>
     </w:p>
     <w:p>
@@ -10292,7 +9698,7 @@
           <w:sz w:val="22"/>
           <w:szCs w:val="22"/>
         </w:rPr>
-        <w:t xml:space="preserve">☐  Vigente     ☐  Vigente com alterações     ☐  Revogada     ☐  Suspensa ou invalidada     ☐  Não sei</w:t>
+        <w:t>☒ Vigente     ☐ Vigente com alterações     ☐ Revogada     ☐ Suspensa ou invalidada     ☐ Não sei</w:t>
       </w:r>
     </w:p>
     <w:tbl>
@@ -10338,27 +9744,32 @@
                 <w:sz w:val="22"/>
                 <w:szCs w:val="22"/>
               </w:rPr>
-              <w:t xml:space="preserve">Se alterada, revogada ou suspensa: por qual norma e em quê (se souber):</w:t>
-            </w:r>
-          </w:p>
-          <w:p>
-            <w:r>
-              <w:rPr>
-                <w:rFonts w:ascii="Calibri" w:cs="Calibri" w:eastAsia="Calibri" w:hAnsi="Calibri"/>
-                <w:sz w:val="22"/>
-                <w:szCs w:val="22"/>
-              </w:rPr>
-              <w:t xml:space="preserve"/>
-            </w:r>
-          </w:p>
-          <w:p>
-            <w:r>
-              <w:rPr>
-                <w:rFonts w:ascii="Calibri" w:cs="Calibri" w:eastAsia="Calibri" w:hAnsi="Calibri"/>
-                <w:sz w:val="22"/>
-                <w:szCs w:val="22"/>
-              </w:rPr>
-              <w:t xml:space="preserve"/>
+              <w:t>Se alterada, revogada ou suspensa: Conforme as informações encaminhadas, não foi identificada alteração, revogação ou suspensão posterior. O texto original, isoladamente, não comprova a inexistência de atos posteriores. Fonte: https://www.cfess.org.br/legislacao/view/257/resolucao-10542023.</w:t>
+            </w:r>
+          </w:p>
+          <w:p>
+            <w:r>
+              <w:rPr>
+                <w:rFonts w:ascii="Calibri" w:cs="Calibri" w:eastAsia="Calibri" w:hAnsi="Calibri"/>
+                <w:sz w:val="22"/>
+                <w:szCs w:val="22"/>
+              </w:rPr>
+            </w:r>
+          </w:p>
+          <w:p>
+            <w:r>
+              <w:rPr>
+                <w:rFonts w:ascii="Calibri" w:cs="Calibri" w:eastAsia="Calibri" w:hAnsi="Calibri"/>
+                <w:sz w:val="22"/>
+                <w:szCs w:val="22"/>
+              </w:rPr>
+            </w:r>
+          </w:p>
+          <w:p>
+            <w:r>
+              <w:rPr>
+                <w:highlight w:val="red"/>
+              </w:rPr>
             </w:r>
           </w:p>
         </w:tc>
@@ -10436,6 +9847,11 @@
               <w:t xml:space="preserve"/>
             </w:r>
           </w:p>
+          <w:p>
+            <w:r>
+              <w:t>RESPOSTA: O art. 1º atravessa páginas; excluir rodapé e autenticação da extração. O art. 7º também contém elementos estranhos e está incompleto. Fonte: https://www.cfess.org.br/uploads/legislacao/4314/1054-2023-1.pdf</w:t>
+            </w:r>
+          </w:p>
         </w:tc>
       </w:tr>
     </w:tbl>
@@ -10486,7 +9902,7 @@
         </w:rPr>
         <w:t xml:space="preserve">PDF oficial: </w:t>
       </w:r>
-      <w:hyperlink w:history="1" r:id="rIdtxsy-ezaa9bvqh6auijz3">
+      <w:hyperlink w:history="1" r:id="rIdppzad0jivka6hmmnk0n6j">
         <w:r>
           <w:rPr>
             <w:rFonts w:ascii="Calibri" w:cs="Calibri" w:eastAsia="Calibri" w:hAnsi="Calibri"/>
@@ -10506,7 +9922,7 @@
         </w:rPr>
         <w:t xml:space="preserve">   ·   </w:t>
       </w:r>
-      <w:hyperlink w:history="1" r:id="rId7hhxovslt3kn7yk0ten4s">
+      <w:hyperlink w:history="1" r:id="rIdxkoz9zacl49z1oo_jmlbv">
         <w:r>
           <w:rPr>
             <w:rFonts w:ascii="Calibri" w:cs="Calibri" w:eastAsia="Calibri" w:hAnsi="Calibri"/>
@@ -10536,16 +9952,16 @@
       </w:r>
     </w:p>
     <w:p>
+      <w:r>
+        <w:t>RESPOSTA: O PDF recebido contém 4 páginas, a resolução, assinatura, informação de publicação e nota de retificação. O arquivo corresponde ao nome indicado na atividade; sua autenticidade não foi verificada por comparação de arquivos.</w:t>
+      </w:r>
+    </w:p>
+    <w:p>
       <w:pPr>
         <w:spacing w:after="100"/>
       </w:pPr>
       <w:r>
-        <w:rPr>
-          <w:rFonts w:ascii="Calibri" w:cs="Calibri" w:eastAsia="Calibri" w:hAnsi="Calibri"/>
-          <w:sz w:val="22"/>
-          <w:szCs w:val="22"/>
-        </w:rPr>
-        <w:t xml:space="preserve">☐  Sim     ☐  Não     ☐  Não consegui verificar</w:t>
+        <w:t>☒ Sim, quanto ao conteúdo identificado     ☐ Não     ☐ Não consegui verificar</w:t>
       </w:r>
     </w:p>
     <w:p>
@@ -10815,22 +10231,7 @@
           </w:tcPr>
           <w:p>
             <w:r>
-              <w:rPr>
-                <w:rFonts w:ascii="Calibri" w:cs="Calibri" w:eastAsia="Calibri" w:hAnsi="Calibri"/>
-                <w:sz w:val="22"/>
-                <w:szCs w:val="22"/>
-              </w:rPr>
-              <w:t xml:space="preserve">☐ Sim</w:t>
-            </w:r>
-          </w:p>
-          <w:p>
-            <w:r>
-              <w:rPr>
-                <w:rFonts w:ascii="Calibri" w:cs="Calibri" w:eastAsia="Calibri" w:hAnsi="Calibri"/>
-                <w:sz w:val="22"/>
-                <w:szCs w:val="22"/>
-              </w:rPr>
-              <w:t xml:space="preserve">☐ Não</w:t>
+              <w:t>☒ Sim     ☐ Não</w:t>
             </w:r>
           </w:p>
         </w:tc>
@@ -10939,22 +10340,7 @@
           </w:tcPr>
           <w:p>
             <w:r>
-              <w:rPr>
-                <w:rFonts w:ascii="Calibri" w:cs="Calibri" w:eastAsia="Calibri" w:hAnsi="Calibri"/>
-                <w:sz w:val="22"/>
-                <w:szCs w:val="22"/>
-              </w:rPr>
-              <w:t xml:space="preserve">☐ Sim</w:t>
-            </w:r>
-          </w:p>
-          <w:p>
-            <w:r>
-              <w:rPr>
-                <w:rFonts w:ascii="Calibri" w:cs="Calibri" w:eastAsia="Calibri" w:hAnsi="Calibri"/>
-                <w:sz w:val="22"/>
-                <w:szCs w:val="22"/>
-              </w:rPr>
-              <w:t xml:space="preserve">☐ Não</w:t>
+              <w:t>☒ Sim     ☐ Não</w:t>
             </w:r>
           </w:p>
         </w:tc>
@@ -11063,22 +10449,7 @@
           </w:tcPr>
           <w:p>
             <w:r>
-              <w:rPr>
-                <w:rFonts w:ascii="Calibri" w:cs="Calibri" w:eastAsia="Calibri" w:hAnsi="Calibri"/>
-                <w:sz w:val="22"/>
-                <w:szCs w:val="22"/>
-              </w:rPr>
-              <w:t xml:space="preserve">☐ Sim</w:t>
-            </w:r>
-          </w:p>
-          <w:p>
-            <w:r>
-              <w:rPr>
-                <w:rFonts w:ascii="Calibri" w:cs="Calibri" w:eastAsia="Calibri" w:hAnsi="Calibri"/>
-                <w:sz w:val="22"/>
-                <w:szCs w:val="22"/>
-              </w:rPr>
-              <w:t xml:space="preserve">☐ Não</w:t>
+              <w:t>☐ Sim     ☒ Não, como exibido: o trecho encerra com reticências. A parte visível corresponde ao PDF.</w:t>
             </w:r>
           </w:p>
         </w:tc>
@@ -11101,16 +10472,19 @@
       </w:r>
     </w:p>
     <w:p>
+      <w:r>
+        <w:rPr>
+          <w:highlight w:val="red"/>
+        </w:rPr>
+        <w:t>RESPOSTA: Vigente, conforme as informações encaminhadas. A ementa foi objeto de retificação publicada no DOU em 13/12/2024. Não foram informadas revogação, suspensão ou alterações posteriores. Fonte: https://www.cfess.org.br/arquivos/1084-2024.pdf.</w:t>
+      </w:r>
+    </w:p>
+    <w:p>
       <w:pPr>
         <w:spacing w:after="100"/>
       </w:pPr>
       <w:r>
-        <w:rPr>
-          <w:rFonts w:ascii="Calibri" w:cs="Calibri" w:eastAsia="Calibri" w:hAnsi="Calibri"/>
-          <w:sz w:val="22"/>
-          <w:szCs w:val="22"/>
-        </w:rPr>
-        <w:t xml:space="preserve">☐  Vigente     ☐  Vigente com alterações     ☐  Revogada     ☐  Suspensa ou invalidada     ☐  Não sei</w:t>
+        <w:t>☒ Vigente     ☐ Vigente com alterações     ☐ Revogada     ☐ Suspensa ou invalidada     ☐ Não sei</w:t>
       </w:r>
     </w:p>
     <w:tbl>
@@ -11149,34 +10523,9 @@
           <w:p>
             <w:r>
               <w:rPr>
-                <w:rFonts w:ascii="Calibri" w:cs="Calibri" w:eastAsia="Calibri" w:hAnsi="Calibri"/>
-                <w:i/>
-                <w:iCs/>
-                <w:color w:val="4F5D70"/>
-                <w:sz w:val="22"/>
-                <w:szCs w:val="22"/>
-              </w:rPr>
-              <w:t xml:space="preserve">Se alterada, revogada ou suspensa: por qual norma e em quê (se souber):</w:t>
-            </w:r>
-          </w:p>
-          <w:p>
-            <w:r>
-              <w:rPr>
-                <w:rFonts w:ascii="Calibri" w:cs="Calibri" w:eastAsia="Calibri" w:hAnsi="Calibri"/>
-                <w:sz w:val="22"/>
-                <w:szCs w:val="22"/>
-              </w:rPr>
-              <w:t xml:space="preserve"/>
-            </w:r>
-          </w:p>
-          <w:p>
-            <w:r>
-              <w:rPr>
-                <w:rFonts w:ascii="Calibri" w:cs="Calibri" w:eastAsia="Calibri" w:hAnsi="Calibri"/>
-                <w:sz w:val="22"/>
-                <w:szCs w:val="22"/>
-              </w:rPr>
-              <w:t xml:space="preserve"/>
+                <w:highlight w:val="red"/>
+              </w:rPr>
+              <w:t>Se alterada, revogada ou suspensa: O PDF registra retificação da ementa publicada no DOU em 13/12/2024; retificação não equivale, por si, à revogação da norma. Conforme as informações encaminhadas, não foram identificadas outras alterações, revogação ou suspensão. Fonte: https://www.cfess.org.br/arquivos/1084-2024.pdf.</w:t>
             </w:r>
           </w:p>
         </w:tc>
@@ -11233,25 +10582,9 @@
           </w:tcPr>
           <w:p>
             <w:r>
-              <w:rPr>
-                <w:rFonts w:ascii="Calibri" w:cs="Calibri" w:eastAsia="Calibri" w:hAnsi="Calibri"/>
-                <w:i/>
-                <w:iCs/>
-                <w:color w:val="4F5D70"/>
-                <w:sz w:val="22"/>
-                <w:szCs w:val="22"/>
-              </w:rPr>
-              <w:t xml:space="preserve">Algo a corrigir ou registrar sobre este documento:</w:t>
-            </w:r>
-          </w:p>
-          <w:p>
-            <w:r>
-              <w:rPr>
-                <w:rFonts w:ascii="Calibri" w:cs="Calibri" w:eastAsia="Calibri" w:hAnsi="Calibri"/>
-                <w:sz w:val="22"/>
-                <w:szCs w:val="22"/>
-              </w:rPr>
-              <w:t xml:space="preserve"/>
+              <w:t>Algo a corrigir ou registrar sobre este documento:</w:t>
+              <w:br/>
+              <w:t>O inciso XIV, na página 3, continua após “independentemente de sua”: “vertente, dentre outros.” O trecho exibido no formulário está abreviado; não é possível inferir apenas dessa exibição se o sistema armazenou o inciso completo. O PDF apresenta a nota de retificação da ementa na página 4. Fonte: 1084-2024.pdf, páginas 2 a 4.</w:t>
             </w:r>
           </w:p>
         </w:tc>
@@ -11288,7 +10621,7 @@
         </w:rPr>
         <w:t xml:space="preserve">PDF oficial: </w:t>
       </w:r>
-      <w:hyperlink w:history="1" r:id="rIdkpbpxzrocx0iza0kvumfb">
+      <w:hyperlink w:history="1" r:id="rIdsbq0opxxlqllhb5kgnsnl">
         <w:r>
           <w:rPr>
             <w:rFonts w:ascii="Calibri" w:cs="Calibri" w:eastAsia="Calibri" w:hAnsi="Calibri"/>
@@ -11308,7 +10641,7 @@
         </w:rPr>
         <w:t xml:space="preserve">   ·   </w:t>
       </w:r>
-      <w:hyperlink w:history="1" r:id="rIdmdfe2wtwjipkmt-_awtnn">
+      <w:hyperlink w:history="1" r:id="rId1ldnv4iksau6ijbmietlp">
         <w:r>
           <w:rPr>
             <w:rFonts w:ascii="Calibri" w:cs="Calibri" w:eastAsia="Calibri" w:hAnsi="Calibri"/>
@@ -11408,6 +10741,14 @@
                 <w:szCs w:val="22"/>
               </w:rPr>
               <w:t xml:space="preserve"/>
+            </w:r>
+          </w:p>
+          <w:p>
+            <w:r>
+              <w:rPr>
+                <w:highlight w:val="red"/>
+              </w:rPr>
+              <w:t>Não foi possível consultar o PDF original indicado da Resolução 954/2020; por isso, não é seguro transcrever o art. 1º original. Atenção: a Resolução 970/2021, art. 2º, apresenta redação posterior para o art. 1º da Resolução 954. Essa redação não substitui a conferência solicitada do documento original. Fonte: https://www.cfess.org.br/arquivos/ResolucaoCfess9702021.pdf</w:t>
             </w:r>
           </w:p>
         </w:tc>

</xml_diff>